<commit_message>
Finished templating the Sprint Report 3
</commit_message>
<xml_diff>
--- a/docs/srDesign_SprintReport3.docx
+++ b/docs/srDesign_SprintReport3.docx
@@ -26,6 +26,31 @@
         <w:br/>
         <w:t>Project STBMF</w:t>
       </w:r>
+      <w:r>
+        <w:br/>
+        <w:t>November 7</w:t>
+      </w:r>
+      <w:r>
+        <w:rPr>
+          <w:vertAlign w:val="superscript"/>
+        </w:rPr>
+        <w:t>th</w:t>
+      </w:r>
+      <w:r>
+        <w:t xml:space="preserve"> – December </w:t>
+      </w:r>
+      <w:r>
+        <w:t>5</w:t>
+      </w:r>
+      <w:r>
+        <w:rPr>
+          <w:vertAlign w:val="superscript"/>
+        </w:rPr>
+        <w:t>th</w:t>
+      </w:r>
+      <w:r>
+        <w:t>, 2012</w:t>
+      </w:r>
     </w:p>
     <w:p>
       <w:r>
@@ -468,7 +493,31 @@
         <w:pStyle w:val="Heading1"/>
       </w:pPr>
       <w:r>
-        <w:t>Product Backlog</w:t>
+        <w:t>Work Carried to Next Sprint</w:t>
+      </w:r>
+    </w:p>
+    <w:p>
+      <w:pPr>
+        <w:pStyle w:val="Heading2"/>
+      </w:pPr>
+      <w:r>
+        <w:t>vSTB</w:t>
+      </w:r>
+    </w:p>
+    <w:p>
+      <w:pPr>
+        <w:pStyle w:val="Heading2"/>
+      </w:pPr>
+      <w:r>
+        <w:t>vAPMax</w:t>
+      </w:r>
+    </w:p>
+    <w:p>
+      <w:pPr>
+        <w:pStyle w:val="Heading2"/>
+      </w:pPr>
+      <w:r>
+        <w:t>Game Server</w:t>
       </w:r>
       <w:bookmarkStart w:id="0" w:name="_GoBack"/>
       <w:bookmarkEnd w:id="0"/>
@@ -1757,7 +1806,7 @@
 </file>
 
 <file path=customXml/itemProps1.xml><?xml version="1.0" encoding="utf-8"?>
-<ds:datastoreItem xmlns:ds="http://schemas.openxmlformats.org/officeDocument/2006/customXml" ds:itemID="{2FEF13F1-CB81-40C2-BBAF-05C2DC1A6791}">
+<ds:datastoreItem xmlns:ds="http://schemas.openxmlformats.org/officeDocument/2006/customXml" ds:itemID="{6D819317-B4EF-4344-AFD4-6DD69242C8EE}">
   <ds:schemaRefs>
     <ds:schemaRef ds:uri="http://schemas.openxmlformats.org/officeDocument/2006/bibliography"/>
   </ds:schemaRefs>

</xml_diff>

<commit_message>
vstb sprint3 report section
</commit_message>
<xml_diff>
--- a/docs/srDesign_SprintReport3.docx
+++ b/docs/srDesign_SprintReport3.docx
@@ -20,8 +20,13 @@
       </w:r>
       <w:r>
         <w:br/>
-        <w:t>David Jarman, Marshall Gaucher, Kevin Worner</w:t>
-      </w:r>
+        <w:t xml:space="preserve">David Jarman, Marshall Gaucher, Kevin </w:t>
+      </w:r>
+      <w:proofErr w:type="spellStart"/>
+      <w:r>
+        <w:t>Worner</w:t>
+      </w:r>
+      <w:proofErr w:type="spellEnd"/>
       <w:r>
         <w:br/>
         <w:t>Project STBMF</w:t>
@@ -105,7 +110,15 @@
         </w:numPr>
       </w:pPr>
       <w:r>
-        <w:t>Send CommandLink messages</w:t>
+        <w:t xml:space="preserve">Send </w:t>
+      </w:r>
+      <w:proofErr w:type="spellStart"/>
+      <w:r>
+        <w:t>CommandLink</w:t>
+      </w:r>
+      <w:proofErr w:type="spellEnd"/>
+      <w:r>
+        <w:t xml:space="preserve"> messages</w:t>
       </w:r>
     </w:p>
     <w:p>
@@ -180,7 +193,15 @@
         </w:numPr>
       </w:pPr>
       <w:r>
-        <w:t>Receive CommandLink messages</w:t>
+        <w:t xml:space="preserve">Receive </w:t>
+      </w:r>
+      <w:proofErr w:type="spellStart"/>
+      <w:r>
+        <w:t>CommandLink</w:t>
+      </w:r>
+      <w:proofErr w:type="spellEnd"/>
+      <w:r>
+        <w:t xml:space="preserve"> messages</w:t>
       </w:r>
     </w:p>
     <w:p>
@@ -320,7 +341,15 @@
         </w:numPr>
       </w:pPr>
       <w:r>
-        <w:t>Integrate BinarySerializer library</w:t>
+        <w:t xml:space="preserve">Integrate </w:t>
+      </w:r>
+      <w:proofErr w:type="spellStart"/>
+      <w:r>
+        <w:t>BinarySerializer</w:t>
+      </w:r>
+      <w:proofErr w:type="spellEnd"/>
+      <w:r>
+        <w:t xml:space="preserve"> library</w:t>
       </w:r>
     </w:p>
     <w:p>
@@ -332,7 +361,15 @@
         </w:numPr>
       </w:pPr>
       <w:r>
-        <w:t>Create a BinarySerializer compliant class</w:t>
+        <w:t xml:space="preserve">Create a </w:t>
+      </w:r>
+      <w:proofErr w:type="spellStart"/>
+      <w:r>
+        <w:t>BinarySerializer</w:t>
+      </w:r>
+      <w:proofErr w:type="spellEnd"/>
+      <w:r>
+        <w:t xml:space="preserve"> compliant class</w:t>
       </w:r>
       <w:r>
         <w:t xml:space="preserve"> for each message</w:t>
@@ -391,8 +428,13 @@
         <w:pStyle w:val="Heading2"/>
       </w:pPr>
       <w:r>
-        <w:t>Virtual APMax</w:t>
-      </w:r>
+        <w:t xml:space="preserve">Virtual </w:t>
+      </w:r>
+      <w:proofErr w:type="spellStart"/>
+      <w:r>
+        <w:t>APMax</w:t>
+      </w:r>
+      <w:proofErr w:type="spellEnd"/>
     </w:p>
     <w:p>
       <w:pPr>
@@ -574,17 +616,277 @@
       <w:pPr>
         <w:pStyle w:val="Heading2"/>
       </w:pPr>
+      <w:proofErr w:type="spellStart"/>
+      <w:proofErr w:type="gramStart"/>
       <w:r>
         <w:t>vSTB</w:t>
       </w:r>
+      <w:proofErr w:type="spellEnd"/>
+      <w:proofErr w:type="gramEnd"/>
+    </w:p>
+    <w:p>
+      <w:pPr>
+        <w:pStyle w:val="ListParagraph"/>
+        <w:numPr>
+          <w:ilvl w:val="0"/>
+          <w:numId w:val="10"/>
+        </w:numPr>
+      </w:pPr>
+      <w:r>
+        <w:t xml:space="preserve">Stabilize </w:t>
+      </w:r>
+      <w:proofErr w:type="spellStart"/>
+      <w:r>
+        <w:t>vSTB</w:t>
+      </w:r>
+      <w:proofErr w:type="spellEnd"/>
+      <w:r>
+        <w:t xml:space="preserve"> communication layer</w:t>
+      </w:r>
+    </w:p>
+    <w:p>
+      <w:pPr>
+        <w:pStyle w:val="ListParagraph"/>
+        <w:numPr>
+          <w:ilvl w:val="1"/>
+          <w:numId w:val="10"/>
+        </w:numPr>
+      </w:pPr>
+      <w:r>
+        <w:t xml:space="preserve">Network testing with timings and packets to see the limitations of communication layer on a LAN </w:t>
+      </w:r>
+      <w:proofErr w:type="spellStart"/>
+      <w:r>
+        <w:t>vSTB</w:t>
+      </w:r>
+      <w:proofErr w:type="spellEnd"/>
+      <w:r>
+        <w:t xml:space="preserve"> and WLAN </w:t>
+      </w:r>
+      <w:proofErr w:type="spellStart"/>
+      <w:r>
+        <w:t>vSTB</w:t>
+      </w:r>
+      <w:proofErr w:type="spellEnd"/>
+      <w:r>
+        <w:t xml:space="preserve"> within our sandbox environment.</w:t>
+      </w:r>
+    </w:p>
+    <w:p>
+      <w:pPr>
+        <w:pStyle w:val="ListParagraph"/>
+        <w:numPr>
+          <w:ilvl w:val="2"/>
+          <w:numId w:val="10"/>
+        </w:numPr>
+      </w:pPr>
+      <w:r>
+        <w:t>Simulates stress on the communication layer so we don’t have games crashing in multiplayer environment.</w:t>
+      </w:r>
+    </w:p>
+    <w:p>
+      <w:pPr>
+        <w:pStyle w:val="ListParagraph"/>
+        <w:numPr>
+          <w:ilvl w:val="2"/>
+          <w:numId w:val="10"/>
+        </w:numPr>
+      </w:pPr>
+      <w:r>
+        <w:t>Reference point to whose prototype may or may not be causing the issue occurring on the multiplayer environment</w:t>
+      </w:r>
+    </w:p>
+    <w:p>
+      <w:pPr>
+        <w:pStyle w:val="ListParagraph"/>
+        <w:numPr>
+          <w:ilvl w:val="1"/>
+          <w:numId w:val="10"/>
+        </w:numPr>
+      </w:pPr>
+      <w:r>
+        <w:t xml:space="preserve">Provides </w:t>
+      </w:r>
+      <w:proofErr w:type="spellStart"/>
+      <w:r>
+        <w:t>vSTB</w:t>
+      </w:r>
+      <w:proofErr w:type="spellEnd"/>
+      <w:r>
+        <w:t xml:space="preserve"> Tester</w:t>
+      </w:r>
+      <w:r>
+        <w:t xml:space="preserve"> interface</w:t>
+      </w:r>
+      <w:r>
+        <w:t xml:space="preserve"> for </w:t>
+      </w:r>
+      <w:proofErr w:type="spellStart"/>
+      <w:r>
+        <w:t>vAPMAX</w:t>
+      </w:r>
+      <w:proofErr w:type="spellEnd"/>
+      <w:r>
+        <w:t xml:space="preserve"> and Game Server</w:t>
+      </w:r>
+    </w:p>
+    <w:p>
+      <w:pPr>
+        <w:pStyle w:val="ListParagraph"/>
+        <w:numPr>
+          <w:ilvl w:val="2"/>
+          <w:numId w:val="10"/>
+        </w:numPr>
+      </w:pPr>
+      <w:r>
+        <w:t>This way they can validate our sandbox environment from their prototypes communication perspective, without needing to know the finer details of current game architecture</w:t>
+      </w:r>
+    </w:p>
+    <w:p>
+      <w:pPr>
+        <w:pStyle w:val="ListParagraph"/>
+        <w:numPr>
+          <w:ilvl w:val="2"/>
+          <w:numId w:val="10"/>
+        </w:numPr>
+      </w:pPr>
+      <w:r>
+        <w:t>Simplifies unit testing</w:t>
+      </w:r>
+    </w:p>
+    <w:p>
+      <w:pPr>
+        <w:pStyle w:val="ListParagraph"/>
+        <w:numPr>
+          <w:ilvl w:val="2"/>
+          <w:numId w:val="10"/>
+        </w:numPr>
+      </w:pPr>
+      <w:r>
+        <w:t>Generates runtime stats of incoming and outgoing messages using graphs, view/models……</w:t>
+      </w:r>
+    </w:p>
+    <w:p>
+      <w:pPr>
+        <w:pStyle w:val="ListParagraph"/>
+        <w:numPr>
+          <w:ilvl w:val="0"/>
+          <w:numId w:val="10"/>
+        </w:numPr>
+      </w:pPr>
+      <w:r>
+        <w:t xml:space="preserve">Begin </w:t>
+      </w:r>
+      <w:r>
+        <w:t>redesign of current</w:t>
+      </w:r>
+      <w:r>
+        <w:t xml:space="preserve"> game architecture to work</w:t>
+      </w:r>
+      <w:r>
+        <w:t xml:space="preserve"> </w:t>
+      </w:r>
+      <w:r>
+        <w:t>with</w:t>
+      </w:r>
+      <w:r>
+        <w:t xml:space="preserve"> multiplayer game environment</w:t>
+      </w:r>
+    </w:p>
+    <w:p>
+      <w:pPr>
+        <w:pStyle w:val="ListParagraph"/>
+        <w:numPr>
+          <w:ilvl w:val="1"/>
+          <w:numId w:val="10"/>
+        </w:numPr>
+      </w:pPr>
+      <w:r>
+        <w:t xml:space="preserve">Remove load of current files on </w:t>
+      </w:r>
+      <w:proofErr w:type="spellStart"/>
+      <w:r>
+        <w:t>stb</w:t>
+      </w:r>
+      <w:proofErr w:type="spellEnd"/>
+      <w:r>
+        <w:t xml:space="preserve"> (game state, resources, images)</w:t>
+      </w:r>
+    </w:p>
+    <w:p>
+      <w:pPr>
+        <w:pStyle w:val="ListParagraph"/>
+        <w:numPr>
+          <w:ilvl w:val="1"/>
+          <w:numId w:val="10"/>
+        </w:numPr>
+      </w:pPr>
+      <w:r>
+        <w:t>Continue design of memory mapped resource handler to parse in file and images</w:t>
+      </w:r>
+    </w:p>
+    <w:p>
+      <w:pPr>
+        <w:pStyle w:val="ListParagraph"/>
+        <w:numPr>
+          <w:ilvl w:val="1"/>
+          <w:numId w:val="10"/>
+        </w:numPr>
+      </w:pPr>
+      <w:r>
+        <w:t xml:space="preserve">Figure out feasible concepts of dynamic runtime UI to work with </w:t>
+      </w:r>
+      <w:proofErr w:type="spellStart"/>
+      <w:r>
+        <w:t>vAPMAX</w:t>
+      </w:r>
+      <w:proofErr w:type="spellEnd"/>
+      <w:r>
+        <w:t xml:space="preserve"> and Game Server</w:t>
+      </w:r>
+    </w:p>
+    <w:p>
+      <w:pPr>
+        <w:pStyle w:val="ListParagraph"/>
+        <w:numPr>
+          <w:ilvl w:val="0"/>
+          <w:numId w:val="10"/>
+        </w:numPr>
+      </w:pPr>
+      <w:r>
+        <w:t>Begin work on unit testing</w:t>
+      </w:r>
+    </w:p>
+    <w:p>
+      <w:pPr>
+        <w:pStyle w:val="ListParagraph"/>
+        <w:numPr>
+          <w:ilvl w:val="1"/>
+          <w:numId w:val="10"/>
+        </w:numPr>
+      </w:pPr>
+      <w:proofErr w:type="spellStart"/>
+      <w:r>
+        <w:t>QtTestLib</w:t>
+      </w:r>
+      <w:proofErr w:type="spellEnd"/>
+      <w:r>
+        <w:t xml:space="preserve"> to minimize tedious GUI testing</w:t>
+      </w:r>
+      <w:bookmarkStart w:id="0" w:name="_GoBack"/>
+      <w:bookmarkEnd w:id="0"/>
     </w:p>
     <w:p>
       <w:pPr>
         <w:pStyle w:val="Heading2"/>
       </w:pPr>
+      <w:proofErr w:type="spellStart"/>
+      <w:proofErr w:type="gramStart"/>
       <w:r>
         <w:t>vAPMax</w:t>
       </w:r>
+      <w:proofErr w:type="spellEnd"/>
+      <w:proofErr w:type="gramEnd"/>
     </w:p>
     <w:p>
       <w:pPr>
@@ -609,8 +911,6 @@
       <w:r>
         <w:t>Use message type to determine what type of device the destination is</w:t>
       </w:r>
-      <w:bookmarkStart w:id="0" w:name="_GoBack"/>
-      <w:bookmarkEnd w:id="0"/>
     </w:p>
     <w:p>
       <w:pPr>
@@ -634,6 +934,7 @@
         </w:numPr>
       </w:pPr>
       <w:r>
+        <w:lastRenderedPageBreak/>
         <w:t>Plugin interface</w:t>
       </w:r>
     </w:p>
@@ -702,6 +1003,30 @@
       </w:pPr>
       <w:r>
         <w:t>Prototypes</w:t>
+      </w:r>
+    </w:p>
+    <w:p>
+      <w:proofErr w:type="spellStart"/>
+      <w:proofErr w:type="gramStart"/>
+      <w:r>
+        <w:t>vSTB</w:t>
+      </w:r>
+      <w:proofErr w:type="spellEnd"/>
+      <w:proofErr w:type="gramEnd"/>
+      <w:r>
+        <w:t xml:space="preserve"> Tester</w:t>
+      </w:r>
+    </w:p>
+    <w:p>
+      <w:proofErr w:type="spellStart"/>
+      <w:proofErr w:type="gramStart"/>
+      <w:r>
+        <w:t>vSTB</w:t>
+      </w:r>
+      <w:proofErr w:type="spellEnd"/>
+      <w:proofErr w:type="gramEnd"/>
+      <w:r>
+        <w:t xml:space="preserve"> Multiplayer Environment</w:t>
       </w:r>
     </w:p>
     <w:sectPr>
@@ -1150,6 +1475,95 @@
     </w:lvl>
   </w:abstractNum>
   <w:abstractNum w:abstractNumId="5">
+    <w:nsid w:val="4078065E"/>
+    <w:multiLevelType w:val="hybridMultilevel"/>
+    <w:tmpl w:val="1AE66632"/>
+    <w:lvl w:ilvl="0" w:tplc="0409000F">
+      <w:start w:val="1"/>
+      <w:numFmt w:val="decimal"/>
+      <w:lvlText w:val="%1."/>
+      <w:lvlJc w:val="left"/>
+      <w:pPr>
+        <w:ind w:left="720" w:hanging="360"/>
+      </w:pPr>
+      <w:rPr>
+        <w:rFonts w:hint="default"/>
+      </w:rPr>
+    </w:lvl>
+    <w:lvl w:ilvl="1" w:tplc="04090019">
+      <w:start w:val="1"/>
+      <w:numFmt w:val="lowerLetter"/>
+      <w:lvlText w:val="%2."/>
+      <w:lvlJc w:val="left"/>
+      <w:pPr>
+        <w:ind w:left="1440" w:hanging="360"/>
+      </w:pPr>
+    </w:lvl>
+    <w:lvl w:ilvl="2" w:tplc="0409001B">
+      <w:start w:val="1"/>
+      <w:numFmt w:val="lowerRoman"/>
+      <w:lvlText w:val="%3."/>
+      <w:lvlJc w:val="right"/>
+      <w:pPr>
+        <w:ind w:left="2160" w:hanging="180"/>
+      </w:pPr>
+    </w:lvl>
+    <w:lvl w:ilvl="3" w:tplc="0409000F" w:tentative="1">
+      <w:start w:val="1"/>
+      <w:numFmt w:val="decimal"/>
+      <w:lvlText w:val="%4."/>
+      <w:lvlJc w:val="left"/>
+      <w:pPr>
+        <w:ind w:left="2880" w:hanging="360"/>
+      </w:pPr>
+    </w:lvl>
+    <w:lvl w:ilvl="4" w:tplc="04090019" w:tentative="1">
+      <w:start w:val="1"/>
+      <w:numFmt w:val="lowerLetter"/>
+      <w:lvlText w:val="%5."/>
+      <w:lvlJc w:val="left"/>
+      <w:pPr>
+        <w:ind w:left="3600" w:hanging="360"/>
+      </w:pPr>
+    </w:lvl>
+    <w:lvl w:ilvl="5" w:tplc="0409001B" w:tentative="1">
+      <w:start w:val="1"/>
+      <w:numFmt w:val="lowerRoman"/>
+      <w:lvlText w:val="%6."/>
+      <w:lvlJc w:val="right"/>
+      <w:pPr>
+        <w:ind w:left="4320" w:hanging="180"/>
+      </w:pPr>
+    </w:lvl>
+    <w:lvl w:ilvl="6" w:tplc="0409000F" w:tentative="1">
+      <w:start w:val="1"/>
+      <w:numFmt w:val="decimal"/>
+      <w:lvlText w:val="%7."/>
+      <w:lvlJc w:val="left"/>
+      <w:pPr>
+        <w:ind w:left="5040" w:hanging="360"/>
+      </w:pPr>
+    </w:lvl>
+    <w:lvl w:ilvl="7" w:tplc="04090019" w:tentative="1">
+      <w:start w:val="1"/>
+      <w:numFmt w:val="lowerLetter"/>
+      <w:lvlText w:val="%8."/>
+      <w:lvlJc w:val="left"/>
+      <w:pPr>
+        <w:ind w:left="5760" w:hanging="360"/>
+      </w:pPr>
+    </w:lvl>
+    <w:lvl w:ilvl="8" w:tplc="0409001B" w:tentative="1">
+      <w:start w:val="1"/>
+      <w:numFmt w:val="lowerRoman"/>
+      <w:lvlText w:val="%9."/>
+      <w:lvlJc w:val="right"/>
+      <w:pPr>
+        <w:ind w:left="6480" w:hanging="180"/>
+      </w:pPr>
+    </w:lvl>
+  </w:abstractNum>
+  <w:abstractNum w:abstractNumId="6">
     <w:nsid w:val="477358FC"/>
     <w:multiLevelType w:val="multilevel"/>
     <w:tmpl w:val="0409001F"/>
@@ -1235,7 +1649,7 @@
       </w:pPr>
     </w:lvl>
   </w:abstractNum>
-  <w:abstractNum w:abstractNumId="6">
+  <w:abstractNum w:abstractNumId="7">
     <w:nsid w:val="6B376063"/>
     <w:multiLevelType w:val="multilevel"/>
     <w:tmpl w:val="0409001F"/>
@@ -1321,7 +1735,7 @@
       </w:pPr>
     </w:lvl>
   </w:abstractNum>
-  <w:abstractNum w:abstractNumId="7">
+  <w:abstractNum w:abstractNumId="8">
     <w:nsid w:val="6CA70939"/>
     <w:multiLevelType w:val="multilevel"/>
     <w:tmpl w:val="0409001F"/>
@@ -1404,6 +1818,92 @@
       <w:lvlJc w:val="left"/>
       <w:pPr>
         <w:ind w:left="4320" w:hanging="1440"/>
+      </w:pPr>
+    </w:lvl>
+  </w:abstractNum>
+  <w:abstractNum w:abstractNumId="9">
+    <w:nsid w:val="7D921D0E"/>
+    <w:multiLevelType w:val="hybridMultilevel"/>
+    <w:tmpl w:val="C1BCCF96"/>
+    <w:lvl w:ilvl="0" w:tplc="0409000F">
+      <w:start w:val="1"/>
+      <w:numFmt w:val="decimal"/>
+      <w:lvlText w:val="%1."/>
+      <w:lvlJc w:val="left"/>
+      <w:pPr>
+        <w:ind w:left="720" w:hanging="360"/>
+      </w:pPr>
+    </w:lvl>
+    <w:lvl w:ilvl="1" w:tplc="04090019" w:tentative="1">
+      <w:start w:val="1"/>
+      <w:numFmt w:val="lowerLetter"/>
+      <w:lvlText w:val="%2."/>
+      <w:lvlJc w:val="left"/>
+      <w:pPr>
+        <w:ind w:left="1440" w:hanging="360"/>
+      </w:pPr>
+    </w:lvl>
+    <w:lvl w:ilvl="2" w:tplc="0409001B" w:tentative="1">
+      <w:start w:val="1"/>
+      <w:numFmt w:val="lowerRoman"/>
+      <w:lvlText w:val="%3."/>
+      <w:lvlJc w:val="right"/>
+      <w:pPr>
+        <w:ind w:left="2160" w:hanging="180"/>
+      </w:pPr>
+    </w:lvl>
+    <w:lvl w:ilvl="3" w:tplc="0409000F" w:tentative="1">
+      <w:start w:val="1"/>
+      <w:numFmt w:val="decimal"/>
+      <w:lvlText w:val="%4."/>
+      <w:lvlJc w:val="left"/>
+      <w:pPr>
+        <w:ind w:left="2880" w:hanging="360"/>
+      </w:pPr>
+    </w:lvl>
+    <w:lvl w:ilvl="4" w:tplc="04090019" w:tentative="1">
+      <w:start w:val="1"/>
+      <w:numFmt w:val="lowerLetter"/>
+      <w:lvlText w:val="%5."/>
+      <w:lvlJc w:val="left"/>
+      <w:pPr>
+        <w:ind w:left="3600" w:hanging="360"/>
+      </w:pPr>
+    </w:lvl>
+    <w:lvl w:ilvl="5" w:tplc="0409001B" w:tentative="1">
+      <w:start w:val="1"/>
+      <w:numFmt w:val="lowerRoman"/>
+      <w:lvlText w:val="%6."/>
+      <w:lvlJc w:val="right"/>
+      <w:pPr>
+        <w:ind w:left="4320" w:hanging="180"/>
+      </w:pPr>
+    </w:lvl>
+    <w:lvl w:ilvl="6" w:tplc="0409000F" w:tentative="1">
+      <w:start w:val="1"/>
+      <w:numFmt w:val="decimal"/>
+      <w:lvlText w:val="%7."/>
+      <w:lvlJc w:val="left"/>
+      <w:pPr>
+        <w:ind w:left="5040" w:hanging="360"/>
+      </w:pPr>
+    </w:lvl>
+    <w:lvl w:ilvl="7" w:tplc="04090019" w:tentative="1">
+      <w:start w:val="1"/>
+      <w:numFmt w:val="lowerLetter"/>
+      <w:lvlText w:val="%8."/>
+      <w:lvlJc w:val="left"/>
+      <w:pPr>
+        <w:ind w:left="5760" w:hanging="360"/>
+      </w:pPr>
+    </w:lvl>
+    <w:lvl w:ilvl="8" w:tplc="0409001B" w:tentative="1">
+      <w:start w:val="1"/>
+      <w:numFmt w:val="lowerRoman"/>
+      <w:lvlText w:val="%9."/>
+      <w:lvlJc w:val="right"/>
+      <w:pPr>
+        <w:ind w:left="6480" w:hanging="180"/>
       </w:pPr>
     </w:lvl>
   </w:abstractNum>
@@ -1411,7 +1911,7 @@
     <w:abstractNumId w:val="4"/>
   </w:num>
   <w:num w:numId="2">
-    <w:abstractNumId w:val="5"/>
+    <w:abstractNumId w:val="6"/>
   </w:num>
   <w:num w:numId="3">
     <w:abstractNumId w:val="3"/>
@@ -1423,13 +1923,19 @@
     <w:abstractNumId w:val="1"/>
   </w:num>
   <w:num w:numId="6">
-    <w:abstractNumId w:val="6"/>
+    <w:abstractNumId w:val="7"/>
   </w:num>
   <w:num w:numId="7">
-    <w:abstractNumId w:val="7"/>
+    <w:abstractNumId w:val="8"/>
   </w:num>
   <w:num w:numId="8">
     <w:abstractNumId w:val="0"/>
+  </w:num>
+  <w:num w:numId="9">
+    <w:abstractNumId w:val="9"/>
+  </w:num>
+  <w:num w:numId="10">
+    <w:abstractNumId w:val="5"/>
   </w:num>
 </w:numbering>
 </file>
@@ -2436,7 +2942,7 @@
 </file>
 
 <file path=customXml/itemProps1.xml><?xml version="1.0" encoding="utf-8"?>
-<ds:datastoreItem xmlns:ds="http://schemas.openxmlformats.org/officeDocument/2006/customXml" ds:itemID="{08DCCB12-1003-4A32-887B-2F2B748ABD26}">
+<ds:datastoreItem xmlns:ds="http://schemas.openxmlformats.org/officeDocument/2006/customXml" ds:itemID="{2A822A5B-F419-405B-B9CC-5DA1D248C9D0}">
   <ds:schemaRefs>
     <ds:schemaRef ds:uri="http://schemas.openxmlformats.org/officeDocument/2006/bibliography"/>
   </ds:schemaRefs>

</xml_diff>

<commit_message>
sprint 3 report updated with vstb info
</commit_message>
<xml_diff>
--- a/docs/srDesign_SprintReport3.docx
+++ b/docs/srDesign_SprintReport3.docx
@@ -693,7 +693,10 @@
         </w:numPr>
       </w:pPr>
       <w:r>
-        <w:t>Reference point to whose prototype may or may not be causing the issue occurring on the multiplayer environment</w:t>
+        <w:t>Provides a r</w:t>
+      </w:r>
+      <w:r>
+        <w:t>eference point to whose prototype may or may not be causing the issue occurring on the multiplayer environment</w:t>
       </w:r>
     </w:p>
     <w:p>
@@ -738,8 +741,16 @@
           <w:numId w:val="10"/>
         </w:numPr>
       </w:pPr>
-      <w:r>
-        <w:t>This way they can validate our sandbox environment from their prototypes communication perspective, without needing to know the finer details of current game architecture</w:t>
+      <w:proofErr w:type="spellStart"/>
+      <w:r>
+        <w:t>vAPMAX</w:t>
+      </w:r>
+      <w:proofErr w:type="spellEnd"/>
+      <w:r>
+        <w:t xml:space="preserve"> and Game Server can</w:t>
+      </w:r>
+      <w:r>
+        <w:t xml:space="preserve"> validate our sandbox environment, without needing to know the finer details of current game architecture</w:t>
       </w:r>
     </w:p>
     <w:p>
@@ -804,11 +815,9 @@
       <w:r>
         <w:t xml:space="preserve">Remove load of current files on </w:t>
       </w:r>
-      <w:proofErr w:type="spellStart"/>
-      <w:r>
-        <w:t>stb</w:t>
-      </w:r>
-      <w:proofErr w:type="spellEnd"/>
+      <w:r>
+        <w:t>STB</w:t>
+      </w:r>
       <w:r>
         <w:t xml:space="preserve"> (game state, resources, images)</w:t>
       </w:r>
@@ -844,6 +853,11 @@
       <w:r>
         <w:t xml:space="preserve"> and Game Server</w:t>
       </w:r>
+      <w:r>
+        <w:t xml:space="preserve"> communications</w:t>
+      </w:r>
+      <w:bookmarkStart w:id="0" w:name="_GoBack"/>
+      <w:bookmarkEnd w:id="0"/>
     </w:p>
     <w:p>
       <w:pPr>
@@ -873,8 +887,6 @@
       <w:r>
         <w:t xml:space="preserve"> to minimize tedious GUI testing</w:t>
       </w:r>
-      <w:bookmarkStart w:id="0" w:name="_GoBack"/>
-      <w:bookmarkEnd w:id="0"/>
     </w:p>
     <w:p>
       <w:pPr>
@@ -934,7 +946,6 @@
         </w:numPr>
       </w:pPr>
       <w:r>
-        <w:lastRenderedPageBreak/>
         <w:t>Plugin interface</w:t>
       </w:r>
     </w:p>
@@ -947,6 +958,7 @@
         </w:numPr>
       </w:pPr>
       <w:r>
+        <w:lastRenderedPageBreak/>
         <w:t>Sending to multiple STBs</w:t>
       </w:r>
     </w:p>
@@ -998,6 +1010,51 @@
       </w:r>
     </w:p>
     <w:p>
+      <w:r>
+        <w:t xml:space="preserve">The only issues from a </w:t>
+      </w:r>
+      <w:proofErr w:type="spellStart"/>
+      <w:r>
+        <w:t>vSTB</w:t>
+      </w:r>
+      <w:proofErr w:type="spellEnd"/>
+      <w:r>
+        <w:t xml:space="preserve"> standpoint, is the idea of how to deploy the actual game logic to the </w:t>
+      </w:r>
+      <w:proofErr w:type="spellStart"/>
+      <w:r>
+        <w:t>vSTB</w:t>
+      </w:r>
+      <w:proofErr w:type="spellEnd"/>
+      <w:r>
+        <w:t xml:space="preserve"> from the Game Server. Our design should be able to deploy the logic to the </w:t>
+      </w:r>
+      <w:proofErr w:type="spellStart"/>
+      <w:r>
+        <w:t>vSTB</w:t>
+      </w:r>
+      <w:proofErr w:type="spellEnd"/>
+      <w:r>
+        <w:t xml:space="preserve"> and the </w:t>
+      </w:r>
+      <w:proofErr w:type="spellStart"/>
+      <w:r>
+        <w:t>vSTB</w:t>
+      </w:r>
+      <w:proofErr w:type="spellEnd"/>
+      <w:r>
+        <w:t xml:space="preserve"> will only be in charge of sending off the end turn move, while all the intermediate moves are managed by the game logic is stored locally on the </w:t>
+      </w:r>
+      <w:proofErr w:type="spellStart"/>
+      <w:r>
+        <w:t>vSTB</w:t>
+      </w:r>
+      <w:proofErr w:type="spellEnd"/>
+      <w:r>
+        <w:t xml:space="preserve"> during the lifespan of the game.</w:t>
+      </w:r>
+    </w:p>
+    <w:p>
       <w:pPr>
         <w:pStyle w:val="Heading1"/>
       </w:pPr>
@@ -1006,6 +1063,9 @@
       </w:r>
     </w:p>
     <w:p>
+      <w:pPr>
+        <w:pStyle w:val="Heading2"/>
+      </w:pPr>
       <w:proofErr w:type="spellStart"/>
       <w:proofErr w:type="gramStart"/>
       <w:r>
@@ -1018,6 +1078,46 @@
       </w:r>
     </w:p>
     <w:p>
+      <w:r>
+        <w:t xml:space="preserve">The </w:t>
+      </w:r>
+      <w:proofErr w:type="spellStart"/>
+      <w:r>
+        <w:t>vSTB</w:t>
+      </w:r>
+      <w:proofErr w:type="spellEnd"/>
+      <w:r>
+        <w:t xml:space="preserve"> Tester will be designed for the </w:t>
+      </w:r>
+      <w:proofErr w:type="spellStart"/>
+      <w:r>
+        <w:t>vAPMAX</w:t>
+      </w:r>
+      <w:proofErr w:type="spellEnd"/>
+      <w:r>
+        <w:t xml:space="preserve"> and Game Server to simplify communication testing of the sand box environment. This way they can test their new Command Link messages without having to have my </w:t>
+      </w:r>
+      <w:proofErr w:type="spellStart"/>
+      <w:r>
+        <w:t>vSTB</w:t>
+      </w:r>
+      <w:proofErr w:type="spellEnd"/>
+      <w:r>
+        <w:t xml:space="preserve"> up and running. More importantly it provides graphs and view/models of the incoming and outgoing messages so they no longer have to sit and read console output. The </w:t>
+      </w:r>
+      <w:proofErr w:type="spellStart"/>
+      <w:r>
+        <w:t>vSTB</w:t>
+      </w:r>
+      <w:proofErr w:type="spellEnd"/>
+      <w:r>
+        <w:t xml:space="preserve"> Tester will provide them with an intuitive tool that will speed up our overall development time across the sandbox environment.</w:t>
+      </w:r>
+    </w:p>
+    <w:p>
+      <w:pPr>
+        <w:pStyle w:val="Heading2"/>
+      </w:pPr>
       <w:proofErr w:type="spellStart"/>
       <w:proofErr w:type="gramStart"/>
       <w:r>
@@ -1027,6 +1127,35 @@
       <w:proofErr w:type="gramEnd"/>
       <w:r>
         <w:t xml:space="preserve"> Multiplayer Environment</w:t>
+      </w:r>
+    </w:p>
+    <w:p>
+      <w:r>
+        <w:t xml:space="preserve">The </w:t>
+      </w:r>
+      <w:proofErr w:type="spellStart"/>
+      <w:r>
+        <w:t>vSTB</w:t>
+      </w:r>
+      <w:proofErr w:type="spellEnd"/>
+      <w:r>
+        <w:t xml:space="preserve"> Multiplayer Environment is still in initial design phase but we do have some feasible ideas that can’t be confirmed until we stabilize the communication layer between the </w:t>
+      </w:r>
+      <w:proofErr w:type="spellStart"/>
+      <w:r>
+        <w:t>vSTB</w:t>
+      </w:r>
+      <w:proofErr w:type="spellEnd"/>
+      <w:r>
+        <w:t xml:space="preserve">, </w:t>
+      </w:r>
+      <w:proofErr w:type="spellStart"/>
+      <w:r>
+        <w:t>vAPMAX</w:t>
+      </w:r>
+      <w:proofErr w:type="spellEnd"/>
+      <w:r>
+        <w:t>, and the Game Server. Once we know the limitations of the communication layer we can then refine our design to actually be testable inside the sandbox environment.</w:t>
       </w:r>
     </w:p>
     <w:sectPr>
@@ -2147,6 +2276,28 @@
       <w:szCs w:val="26"/>
     </w:rPr>
   </w:style>
+  <w:style w:type="paragraph" w:styleId="Heading3">
+    <w:name w:val="heading 3"/>
+    <w:basedOn w:val="Normal"/>
+    <w:next w:val="Normal"/>
+    <w:link w:val="Heading3Char"/>
+    <w:uiPriority w:val="9"/>
+    <w:unhideWhenUsed/>
+    <w:qFormat/>
+    <w:rsid w:val="005F355F"/>
+    <w:pPr>
+      <w:keepNext/>
+      <w:keepLines/>
+      <w:spacing w:before="200" w:after="0"/>
+      <w:outlineLvl w:val="2"/>
+    </w:pPr>
+    <w:rPr>
+      <w:rFonts w:asciiTheme="majorHAnsi" w:eastAsiaTheme="majorEastAsia" w:hAnsiTheme="majorHAnsi" w:cstheme="majorBidi"/>
+      <w:b/>
+      <w:bCs/>
+      <w:color w:val="4F81BD" w:themeColor="accent1"/>
+    </w:rPr>
+  </w:style>
   <w:style w:type="character" w:default="1" w:styleId="DefaultParagraphFont">
     <w:name w:val="Default Paragraph Font"/>
     <w:uiPriority w:val="1"/>
@@ -2292,6 +2443,19 @@
       <w:ind w:left="720"/>
       <w:contextualSpacing/>
     </w:pPr>
+  </w:style>
+  <w:style w:type="character" w:customStyle="1" w:styleId="Heading3Char">
+    <w:name w:val="Heading 3 Char"/>
+    <w:basedOn w:val="DefaultParagraphFont"/>
+    <w:link w:val="Heading3"/>
+    <w:uiPriority w:val="9"/>
+    <w:rsid w:val="005F355F"/>
+    <w:rPr>
+      <w:rFonts w:asciiTheme="majorHAnsi" w:eastAsiaTheme="majorEastAsia" w:hAnsiTheme="majorHAnsi" w:cstheme="majorBidi"/>
+      <w:b/>
+      <w:bCs/>
+      <w:color w:val="4F81BD" w:themeColor="accent1"/>
+    </w:rPr>
   </w:style>
 </w:styles>
 </file>
@@ -2503,6 +2667,28 @@
       <w:szCs w:val="26"/>
     </w:rPr>
   </w:style>
+  <w:style w:type="paragraph" w:styleId="Heading3">
+    <w:name w:val="heading 3"/>
+    <w:basedOn w:val="Normal"/>
+    <w:next w:val="Normal"/>
+    <w:link w:val="Heading3Char"/>
+    <w:uiPriority w:val="9"/>
+    <w:unhideWhenUsed/>
+    <w:qFormat/>
+    <w:rsid w:val="005F355F"/>
+    <w:pPr>
+      <w:keepNext/>
+      <w:keepLines/>
+      <w:spacing w:before="200" w:after="0"/>
+      <w:outlineLvl w:val="2"/>
+    </w:pPr>
+    <w:rPr>
+      <w:rFonts w:asciiTheme="majorHAnsi" w:eastAsiaTheme="majorEastAsia" w:hAnsiTheme="majorHAnsi" w:cstheme="majorBidi"/>
+      <w:b/>
+      <w:bCs/>
+      <w:color w:val="4F81BD" w:themeColor="accent1"/>
+    </w:rPr>
+  </w:style>
   <w:style w:type="character" w:default="1" w:styleId="DefaultParagraphFont">
     <w:name w:val="Default Paragraph Font"/>
     <w:uiPriority w:val="1"/>
@@ -2648,6 +2834,19 @@
       <w:ind w:left="720"/>
       <w:contextualSpacing/>
     </w:pPr>
+  </w:style>
+  <w:style w:type="character" w:customStyle="1" w:styleId="Heading3Char">
+    <w:name w:val="Heading 3 Char"/>
+    <w:basedOn w:val="DefaultParagraphFont"/>
+    <w:link w:val="Heading3"/>
+    <w:uiPriority w:val="9"/>
+    <w:rsid w:val="005F355F"/>
+    <w:rPr>
+      <w:rFonts w:asciiTheme="majorHAnsi" w:eastAsiaTheme="majorEastAsia" w:hAnsiTheme="majorHAnsi" w:cstheme="majorBidi"/>
+      <w:b/>
+      <w:bCs/>
+      <w:color w:val="4F81BD" w:themeColor="accent1"/>
+    </w:rPr>
   </w:style>
 </w:styles>
 </file>
@@ -2942,7 +3141,7 @@
 </file>
 
 <file path=customXml/itemProps1.xml><?xml version="1.0" encoding="utf-8"?>
-<ds:datastoreItem xmlns:ds="http://schemas.openxmlformats.org/officeDocument/2006/customXml" ds:itemID="{2A822A5B-F419-405B-B9CC-5DA1D248C9D0}">
+<ds:datastoreItem xmlns:ds="http://schemas.openxmlformats.org/officeDocument/2006/customXml" ds:itemID="{94FD8140-D55A-446F-AF98-68507BEFD162}">
   <ds:schemaRefs>
     <ds:schemaRef ds:uri="http://schemas.openxmlformats.org/officeDocument/2006/bibliography"/>
   </ds:schemaRefs>

</xml_diff>

<commit_message>
vstb sprint 3 report prototype added
</commit_message>
<xml_diff>
--- a/docs/srDesign_SprintReport3.docx
+++ b/docs/srDesign_SprintReport3.docx
@@ -856,162 +856,285 @@
       <w:r>
         <w:t xml:space="preserve"> communications</w:t>
       </w:r>
+    </w:p>
+    <w:p>
+      <w:pPr>
+        <w:pStyle w:val="ListParagraph"/>
+        <w:numPr>
+          <w:ilvl w:val="0"/>
+          <w:numId w:val="10"/>
+        </w:numPr>
+      </w:pPr>
+      <w:r>
+        <w:t>Begin work on unit testing</w:t>
+      </w:r>
+    </w:p>
+    <w:p>
+      <w:pPr>
+        <w:pStyle w:val="ListParagraph"/>
+        <w:numPr>
+          <w:ilvl w:val="1"/>
+          <w:numId w:val="10"/>
+        </w:numPr>
+      </w:pPr>
+      <w:proofErr w:type="spellStart"/>
+      <w:r>
+        <w:t>QtTestLib</w:t>
+      </w:r>
+      <w:proofErr w:type="spellEnd"/>
+      <w:r>
+        <w:t xml:space="preserve"> to minimize tedious GUI testing</w:t>
+      </w:r>
+    </w:p>
+    <w:p>
+      <w:pPr>
+        <w:pStyle w:val="Heading2"/>
+      </w:pPr>
+      <w:proofErr w:type="spellStart"/>
+      <w:proofErr w:type="gramStart"/>
+      <w:r>
+        <w:t>vAPMax</w:t>
+      </w:r>
+      <w:proofErr w:type="spellEnd"/>
+      <w:proofErr w:type="gramEnd"/>
+    </w:p>
+    <w:p>
+      <w:pPr>
+        <w:pStyle w:val="ListParagraph"/>
+        <w:numPr>
+          <w:ilvl w:val="0"/>
+          <w:numId w:val="8"/>
+        </w:numPr>
+      </w:pPr>
+      <w:r>
+        <w:t>Upgrade current Reactive Extension package to latest and propagate changes throughout prototype</w:t>
+      </w:r>
+    </w:p>
+    <w:p>
+      <w:pPr>
+        <w:pStyle w:val="ListParagraph"/>
+        <w:numPr>
+          <w:ilvl w:val="0"/>
+          <w:numId w:val="8"/>
+        </w:numPr>
+      </w:pPr>
+      <w:r>
+        <w:t>Use message type to determine what type of device the destination is</w:t>
+      </w:r>
+    </w:p>
+    <w:p>
+      <w:pPr>
+        <w:pStyle w:val="Heading2"/>
+      </w:pPr>
+      <w:r>
+        <w:t>Game Server</w:t>
+      </w:r>
+    </w:p>
+    <w:p>
+      <w:r>
+        <w:t>All of the cards for the game server have been completed for this sprint. In the coming sprints, some of the cards for the server are:</w:t>
+      </w:r>
+    </w:p>
+    <w:p>
+      <w:pPr>
+        <w:pStyle w:val="ListParagraph"/>
+        <w:numPr>
+          <w:ilvl w:val="0"/>
+          <w:numId w:val="7"/>
+        </w:numPr>
+      </w:pPr>
+      <w:r>
+        <w:t>Plugin interface</w:t>
+      </w:r>
+    </w:p>
+    <w:p>
+      <w:pPr>
+        <w:pStyle w:val="ListParagraph"/>
+        <w:numPr>
+          <w:ilvl w:val="0"/>
+          <w:numId w:val="7"/>
+        </w:numPr>
+      </w:pPr>
+      <w:r>
+        <w:lastRenderedPageBreak/>
+        <w:t>Sending to multiple STBs</w:t>
+      </w:r>
+    </w:p>
+    <w:p>
+      <w:pPr>
+        <w:pStyle w:val="ListParagraph"/>
+        <w:numPr>
+          <w:ilvl w:val="0"/>
+          <w:numId w:val="7"/>
+        </w:numPr>
+      </w:pPr>
+      <w:r>
+        <w:t>Database</w:t>
+      </w:r>
+    </w:p>
+    <w:p>
+      <w:pPr>
+        <w:pStyle w:val="ListParagraph"/>
+        <w:numPr>
+          <w:ilvl w:val="0"/>
+          <w:numId w:val="7"/>
+        </w:numPr>
+      </w:pPr>
+      <w:r>
+        <w:t xml:space="preserve">UI rework and </w:t>
+      </w:r>
+      <w:r>
+        <w:t>attachment</w:t>
+      </w:r>
+    </w:p>
+    <w:p>
+      <w:pPr>
+        <w:pStyle w:val="ListParagraph"/>
+        <w:numPr>
+          <w:ilvl w:val="0"/>
+          <w:numId w:val="7"/>
+        </w:numPr>
+      </w:pPr>
+      <w:r>
+        <w:t>Conversion to server</w:t>
+      </w:r>
+    </w:p>
+    <w:p>
+      <w:pPr>
+        <w:pStyle w:val="Heading1"/>
+      </w:pPr>
+      <w:r>
+        <w:t>Issues</w:t>
+      </w:r>
+    </w:p>
+    <w:p>
+      <w:r>
+        <w:t xml:space="preserve">The only issues from a </w:t>
+      </w:r>
+      <w:proofErr w:type="spellStart"/>
+      <w:r>
+        <w:t>vSTB</w:t>
+      </w:r>
+      <w:proofErr w:type="spellEnd"/>
+      <w:r>
+        <w:t xml:space="preserve"> standpoint, is the idea of how to deploy the actual game logic to the </w:t>
+      </w:r>
+      <w:proofErr w:type="spellStart"/>
+      <w:r>
+        <w:t>vSTB</w:t>
+      </w:r>
+      <w:proofErr w:type="spellEnd"/>
+      <w:r>
+        <w:t xml:space="preserve"> from the Game Server. Our design should be able to deploy the logic to the </w:t>
+      </w:r>
+      <w:proofErr w:type="spellStart"/>
+      <w:r>
+        <w:t>vSTB</w:t>
+      </w:r>
+      <w:proofErr w:type="spellEnd"/>
+      <w:r>
+        <w:t xml:space="preserve"> and the </w:t>
+      </w:r>
+      <w:proofErr w:type="spellStart"/>
+      <w:r>
+        <w:t>vSTB</w:t>
+      </w:r>
+      <w:proofErr w:type="spellEnd"/>
+      <w:r>
+        <w:t xml:space="preserve"> will only be in charge of sending off the end turn move, while all the intermediate moves are managed by the game logic is stored locally on the </w:t>
+      </w:r>
+      <w:proofErr w:type="spellStart"/>
+      <w:r>
+        <w:t>vSTB</w:t>
+      </w:r>
+      <w:proofErr w:type="spellEnd"/>
+      <w:r>
+        <w:t xml:space="preserve"> during the lifespan of the game.</w:t>
+      </w:r>
+    </w:p>
+    <w:p>
+      <w:pPr>
+        <w:pStyle w:val="Heading1"/>
+      </w:pPr>
+      <w:r>
+        <w:t>Prototypes</w:t>
+      </w:r>
       <w:bookmarkStart w:id="0" w:name="_GoBack"/>
       <w:bookmarkEnd w:id="0"/>
     </w:p>
     <w:p>
       <w:pPr>
-        <w:pStyle w:val="ListParagraph"/>
-        <w:numPr>
-          <w:ilvl w:val="0"/>
-          <w:numId w:val="10"/>
-        </w:numPr>
-      </w:pPr>
-      <w:r>
-        <w:t>Begin work on unit testing</w:t>
-      </w:r>
-    </w:p>
-    <w:p>
-      <w:pPr>
-        <w:pStyle w:val="ListParagraph"/>
-        <w:numPr>
-          <w:ilvl w:val="1"/>
-          <w:numId w:val="10"/>
-        </w:numPr>
-      </w:pPr>
-      <w:proofErr w:type="spellStart"/>
-      <w:r>
-        <w:t>QtTestLib</w:t>
-      </w:r>
-      <w:proofErr w:type="spellEnd"/>
-      <w:r>
-        <w:t xml:space="preserve"> to minimize tedious GUI testing</w:t>
-      </w:r>
-    </w:p>
-    <w:p>
-      <w:pPr>
         <w:pStyle w:val="Heading2"/>
       </w:pPr>
       <w:proofErr w:type="spellStart"/>
       <w:proofErr w:type="gramStart"/>
       <w:r>
-        <w:t>vAPMax</w:t>
+        <w:t>vSTB</w:t>
       </w:r>
       <w:proofErr w:type="spellEnd"/>
       <w:proofErr w:type="gramEnd"/>
-    </w:p>
-    <w:p>
-      <w:pPr>
-        <w:pStyle w:val="ListParagraph"/>
-        <w:numPr>
-          <w:ilvl w:val="0"/>
-          <w:numId w:val="8"/>
-        </w:numPr>
-      </w:pPr>
-      <w:r>
-        <w:t>Upgrade current Reactive Extension package to latest and propagate changes throughout prototype</w:t>
-      </w:r>
-    </w:p>
-    <w:p>
-      <w:pPr>
-        <w:pStyle w:val="ListParagraph"/>
-        <w:numPr>
-          <w:ilvl w:val="0"/>
-          <w:numId w:val="8"/>
-        </w:numPr>
-      </w:pPr>
-      <w:r>
-        <w:t>Use message type to determine what type of device the destination is</w:t>
-      </w:r>
-    </w:p>
-    <w:p>
-      <w:pPr>
-        <w:pStyle w:val="Heading2"/>
-      </w:pPr>
-      <w:r>
-        <w:t>Game Server</w:t>
-      </w:r>
-    </w:p>
-    <w:p>
-      <w:r>
-        <w:t>All of the cards for the game server have been completed for this sprint. In the coming sprints, some of the cards for the server are:</w:t>
-      </w:r>
-    </w:p>
-    <w:p>
-      <w:pPr>
-        <w:pStyle w:val="ListParagraph"/>
-        <w:numPr>
-          <w:ilvl w:val="0"/>
-          <w:numId w:val="7"/>
-        </w:numPr>
-      </w:pPr>
-      <w:r>
-        <w:t>Plugin interface</w:t>
-      </w:r>
-    </w:p>
-    <w:p>
-      <w:pPr>
-        <w:pStyle w:val="ListParagraph"/>
-        <w:numPr>
-          <w:ilvl w:val="0"/>
-          <w:numId w:val="7"/>
-        </w:numPr>
-      </w:pPr>
-      <w:r>
-        <w:lastRenderedPageBreak/>
-        <w:t>Sending to multiple STBs</w:t>
-      </w:r>
-    </w:p>
-    <w:p>
-      <w:pPr>
-        <w:pStyle w:val="ListParagraph"/>
-        <w:numPr>
-          <w:ilvl w:val="0"/>
-          <w:numId w:val="7"/>
-        </w:numPr>
-      </w:pPr>
-      <w:r>
-        <w:t>Database</w:t>
-      </w:r>
-    </w:p>
-    <w:p>
-      <w:pPr>
-        <w:pStyle w:val="ListParagraph"/>
-        <w:numPr>
-          <w:ilvl w:val="0"/>
-          <w:numId w:val="7"/>
-        </w:numPr>
-      </w:pPr>
-      <w:r>
-        <w:t xml:space="preserve">UI rework and </w:t>
-      </w:r>
-      <w:r>
-        <w:t>attachment</w:t>
-      </w:r>
-    </w:p>
-    <w:p>
-      <w:pPr>
-        <w:pStyle w:val="ListParagraph"/>
-        <w:numPr>
-          <w:ilvl w:val="0"/>
-          <w:numId w:val="7"/>
-        </w:numPr>
-      </w:pPr>
-      <w:r>
-        <w:t>Conversion to server</w:t>
-      </w:r>
-    </w:p>
-    <w:p>
-      <w:pPr>
-        <w:pStyle w:val="Heading1"/>
-      </w:pPr>
-      <w:r>
-        <w:t>Issues</w:t>
-      </w:r>
-    </w:p>
-    <w:p>
-      <w:r>
-        <w:t xml:space="preserve">The only issues from a </w:t>
+      <w:r>
+        <w:t xml:space="preserve"> Tester</w:t>
+      </w:r>
+    </w:p>
+    <w:p>
+      <w:r>
+        <w:rPr>
+          <w:noProof/>
+        </w:rPr>
+        <w:drawing>
+          <wp:inline distT="0" distB="0" distL="0" distR="0">
+            <wp:extent cx="5943600" cy="3287605"/>
+            <wp:effectExtent l="0" t="0" r="0" b="8255"/>
+            <wp:docPr id="1" name="Picture 1" descr="Q:\Work\MarshallG\vstb_diags\Screenshot from 2012-12-06 01-46-21.png"/>
+            <wp:cNvGraphicFramePr>
+              <a:graphicFrameLocks xmlns:a="http://schemas.openxmlformats.org/drawingml/2006/main" noChangeAspect="1"/>
+            </wp:cNvGraphicFramePr>
+            <a:graphic xmlns:a="http://schemas.openxmlformats.org/drawingml/2006/main">
+              <a:graphicData uri="http://schemas.openxmlformats.org/drawingml/2006/picture">
+                <pic:pic xmlns:pic="http://schemas.openxmlformats.org/drawingml/2006/picture">
+                  <pic:nvPicPr>
+                    <pic:cNvPr id="0" name="Picture 1" descr="Q:\Work\MarshallG\vstb_diags\Screenshot from 2012-12-06 01-46-21.png"/>
+                    <pic:cNvPicPr>
+                      <a:picLocks noChangeAspect="1" noChangeArrowheads="1"/>
+                    </pic:cNvPicPr>
+                  </pic:nvPicPr>
+                  <pic:blipFill>
+                    <a:blip r:embed="rId7">
+                      <a:extLst>
+                        <a:ext uri="{28A0092B-C50C-407E-A947-70E740481C1C}">
+                          <a14:useLocalDpi xmlns:a14="http://schemas.microsoft.com/office/drawing/2010/main" val="0"/>
+                        </a:ext>
+                      </a:extLst>
+                    </a:blip>
+                    <a:srcRect/>
+                    <a:stretch>
+                      <a:fillRect/>
+                    </a:stretch>
+                  </pic:blipFill>
+                  <pic:spPr bwMode="auto">
+                    <a:xfrm>
+                      <a:off x="0" y="0"/>
+                      <a:ext cx="5943600" cy="3287605"/>
+                    </a:xfrm>
+                    <a:prstGeom prst="rect">
+                      <a:avLst/>
+                    </a:prstGeom>
+                    <a:noFill/>
+                    <a:ln>
+                      <a:noFill/>
+                    </a:ln>
+                  </pic:spPr>
+                </pic:pic>
+              </a:graphicData>
+            </a:graphic>
+          </wp:inline>
+        </w:drawing>
+      </w:r>
+    </w:p>
+    <w:p>
+      <w:r>
+        <w:t xml:space="preserve">The </w:t>
       </w:r>
       <w:proofErr w:type="spellStart"/>
       <w:r>
@@ -1019,15 +1142,23 @@
       </w:r>
       <w:proofErr w:type="spellEnd"/>
       <w:r>
-        <w:t xml:space="preserve"> standpoint, is the idea of how to deploy the actual game logic to the </w:t>
+        <w:t xml:space="preserve"> Tester will be designed for the </w:t>
       </w:r>
       <w:proofErr w:type="spellStart"/>
       <w:r>
+        <w:t>vAPMAX</w:t>
+      </w:r>
+      <w:proofErr w:type="spellEnd"/>
+      <w:r>
+        <w:t xml:space="preserve"> and Game Server to simplify communication testing of the sand box environment. This way they can test their new Command Link messages without having to have my </w:t>
+      </w:r>
+      <w:proofErr w:type="spellStart"/>
+      <w:r>
         <w:t>vSTB</w:t>
       </w:r>
       <w:proofErr w:type="spellEnd"/>
       <w:r>
-        <w:t xml:space="preserve"> from the Game Server. Our design should be able to deploy the logic to the </w:t>
+        <w:t xml:space="preserve"> up and running. More importantly it provides graphs and view/models of the incoming and outgoing messages so they no longer have to sit and read console output. The </w:t>
       </w:r>
       <w:proofErr w:type="spellStart"/>
       <w:r>
@@ -1035,31 +1166,7 @@
       </w:r>
       <w:proofErr w:type="spellEnd"/>
       <w:r>
-        <w:t xml:space="preserve"> and the </w:t>
-      </w:r>
-      <w:proofErr w:type="spellStart"/>
-      <w:r>
-        <w:t>vSTB</w:t>
-      </w:r>
-      <w:proofErr w:type="spellEnd"/>
-      <w:r>
-        <w:t xml:space="preserve"> will only be in charge of sending off the end turn move, while all the intermediate moves are managed by the game logic is stored locally on the </w:t>
-      </w:r>
-      <w:proofErr w:type="spellStart"/>
-      <w:r>
-        <w:t>vSTB</w:t>
-      </w:r>
-      <w:proofErr w:type="spellEnd"/>
-      <w:r>
-        <w:t xml:space="preserve"> during the lifespan of the game.</w:t>
-      </w:r>
-    </w:p>
-    <w:p>
-      <w:pPr>
-        <w:pStyle w:val="Heading1"/>
-      </w:pPr>
-      <w:r>
-        <w:t>Prototypes</w:t>
+        <w:t xml:space="preserve"> Tester will provide them with an intuitive tool that will speed up our overall development time across the sandbox environment.</w:t>
       </w:r>
     </w:p>
     <w:p>
@@ -1069,58 +1176,7 @@
       <w:proofErr w:type="spellStart"/>
       <w:proofErr w:type="gramStart"/>
       <w:r>
-        <w:t>vSTB</w:t>
-      </w:r>
-      <w:proofErr w:type="spellEnd"/>
-      <w:proofErr w:type="gramEnd"/>
-      <w:r>
-        <w:t xml:space="preserve"> Tester</w:t>
-      </w:r>
-    </w:p>
-    <w:p>
-      <w:r>
-        <w:t xml:space="preserve">The </w:t>
-      </w:r>
-      <w:proofErr w:type="spellStart"/>
-      <w:r>
-        <w:t>vSTB</w:t>
-      </w:r>
-      <w:proofErr w:type="spellEnd"/>
-      <w:r>
-        <w:t xml:space="preserve"> Tester will be designed for the </w:t>
-      </w:r>
-      <w:proofErr w:type="spellStart"/>
-      <w:r>
-        <w:t>vAPMAX</w:t>
-      </w:r>
-      <w:proofErr w:type="spellEnd"/>
-      <w:r>
-        <w:t xml:space="preserve"> and Game Server to simplify communication testing of the sand box environment. This way they can test their new Command Link messages without having to have my </w:t>
-      </w:r>
-      <w:proofErr w:type="spellStart"/>
-      <w:r>
-        <w:t>vSTB</w:t>
-      </w:r>
-      <w:proofErr w:type="spellEnd"/>
-      <w:r>
-        <w:t xml:space="preserve"> up and running. More importantly it provides graphs and view/models of the incoming and outgoing messages so they no longer have to sit and read console output. The </w:t>
-      </w:r>
-      <w:proofErr w:type="spellStart"/>
-      <w:r>
-        <w:t>vSTB</w:t>
-      </w:r>
-      <w:proofErr w:type="spellEnd"/>
-      <w:r>
-        <w:t xml:space="preserve"> Tester will provide them with an intuitive tool that will speed up our overall development time across the sandbox environment.</w:t>
-      </w:r>
-    </w:p>
-    <w:p>
-      <w:pPr>
-        <w:pStyle w:val="Heading2"/>
-      </w:pPr>
-      <w:proofErr w:type="spellStart"/>
-      <w:proofErr w:type="gramStart"/>
-      <w:r>
+        <w:lastRenderedPageBreak/>
         <w:t>vSTB</w:t>
       </w:r>
       <w:proofErr w:type="spellEnd"/>
@@ -2457,6 +2513,36 @@
       <w:color w:val="4F81BD" w:themeColor="accent1"/>
     </w:rPr>
   </w:style>
+  <w:style w:type="paragraph" w:styleId="BalloonText">
+    <w:name w:val="Balloon Text"/>
+    <w:basedOn w:val="Normal"/>
+    <w:link w:val="BalloonTextChar"/>
+    <w:uiPriority w:val="99"/>
+    <w:semiHidden/>
+    <w:unhideWhenUsed/>
+    <w:rsid w:val="00D53FE9"/>
+    <w:pPr>
+      <w:spacing w:after="0" w:line="240" w:lineRule="auto"/>
+    </w:pPr>
+    <w:rPr>
+      <w:rFonts w:ascii="Tahoma" w:hAnsi="Tahoma" w:cs="Tahoma"/>
+      <w:sz w:val="16"/>
+      <w:szCs w:val="16"/>
+    </w:rPr>
+  </w:style>
+  <w:style w:type="character" w:customStyle="1" w:styleId="BalloonTextChar">
+    <w:name w:val="Balloon Text Char"/>
+    <w:basedOn w:val="DefaultParagraphFont"/>
+    <w:link w:val="BalloonText"/>
+    <w:uiPriority w:val="99"/>
+    <w:semiHidden/>
+    <w:rsid w:val="00D53FE9"/>
+    <w:rPr>
+      <w:rFonts w:ascii="Tahoma" w:hAnsi="Tahoma" w:cs="Tahoma"/>
+      <w:sz w:val="16"/>
+      <w:szCs w:val="16"/>
+    </w:rPr>
+  </w:style>
 </w:styles>
 </file>
 
@@ -2846,6 +2932,36 @@
       <w:b/>
       <w:bCs/>
       <w:color w:val="4F81BD" w:themeColor="accent1"/>
+    </w:rPr>
+  </w:style>
+  <w:style w:type="paragraph" w:styleId="BalloonText">
+    <w:name w:val="Balloon Text"/>
+    <w:basedOn w:val="Normal"/>
+    <w:link w:val="BalloonTextChar"/>
+    <w:uiPriority w:val="99"/>
+    <w:semiHidden/>
+    <w:unhideWhenUsed/>
+    <w:rsid w:val="00D53FE9"/>
+    <w:pPr>
+      <w:spacing w:after="0" w:line="240" w:lineRule="auto"/>
+    </w:pPr>
+    <w:rPr>
+      <w:rFonts w:ascii="Tahoma" w:hAnsi="Tahoma" w:cs="Tahoma"/>
+      <w:sz w:val="16"/>
+      <w:szCs w:val="16"/>
+    </w:rPr>
+  </w:style>
+  <w:style w:type="character" w:customStyle="1" w:styleId="BalloonTextChar">
+    <w:name w:val="Balloon Text Char"/>
+    <w:basedOn w:val="DefaultParagraphFont"/>
+    <w:link w:val="BalloonText"/>
+    <w:uiPriority w:val="99"/>
+    <w:semiHidden/>
+    <w:rsid w:val="00D53FE9"/>
+    <w:rPr>
+      <w:rFonts w:ascii="Tahoma" w:hAnsi="Tahoma" w:cs="Tahoma"/>
+      <w:sz w:val="16"/>
+      <w:szCs w:val="16"/>
     </w:rPr>
   </w:style>
 </w:styles>
@@ -3141,7 +3257,7 @@
 </file>
 
 <file path=customXml/itemProps1.xml><?xml version="1.0" encoding="utf-8"?>
-<ds:datastoreItem xmlns:ds="http://schemas.openxmlformats.org/officeDocument/2006/customXml" ds:itemID="{94FD8140-D55A-446F-AF98-68507BEFD162}">
+<ds:datastoreItem xmlns:ds="http://schemas.openxmlformats.org/officeDocument/2006/customXml" ds:itemID="{B3B3510B-7511-4C7F-82C7-DF36A93D7328}">
   <ds:schemaRefs>
     <ds:schemaRef ds:uri="http://schemas.openxmlformats.org/officeDocument/2006/bibliography"/>
   </ds:schemaRefs>

</xml_diff>

<commit_message>
updated sprint report 3 with game server changes
</commit_message>
<xml_diff>
--- a/docs/srDesign_SprintReport3.docx
+++ b/docs/srDesign_SprintReport3.docx
@@ -20,13 +20,8 @@
       </w:r>
       <w:r>
         <w:br/>
-        <w:t xml:space="preserve">David Jarman, Marshall Gaucher, Kevin </w:t>
-      </w:r>
-      <w:proofErr w:type="spellStart"/>
-      <w:r>
-        <w:t>Worner</w:t>
-      </w:r>
-      <w:proofErr w:type="spellEnd"/>
+        <w:t>David Jarman, Marshall Gaucher, Kevin Worner</w:t>
+      </w:r>
       <w:r>
         <w:br/>
         <w:t>Project STBMF</w:t>
@@ -428,13 +423,8 @@
         <w:pStyle w:val="Heading2"/>
       </w:pPr>
       <w:r>
-        <w:t xml:space="preserve">Virtual </w:t>
-      </w:r>
-      <w:proofErr w:type="spellStart"/>
-      <w:r>
-        <w:t>APMax</w:t>
-      </w:r>
-      <w:proofErr w:type="spellEnd"/>
+        <w:t>Virtual APMax</w:t>
+      </w:r>
     </w:p>
     <w:p>
       <w:pPr>
@@ -616,12 +606,10 @@
       <w:pPr>
         <w:pStyle w:val="Heading2"/>
       </w:pPr>
-      <w:proofErr w:type="spellStart"/>
       <w:proofErr w:type="gramStart"/>
       <w:r>
         <w:t>vSTB</w:t>
       </w:r>
-      <w:proofErr w:type="spellEnd"/>
       <w:proofErr w:type="gramEnd"/>
     </w:p>
     <w:p>
@@ -633,15 +621,7 @@
         </w:numPr>
       </w:pPr>
       <w:r>
-        <w:t xml:space="preserve">Stabilize </w:t>
-      </w:r>
-      <w:proofErr w:type="spellStart"/>
-      <w:r>
-        <w:t>vSTB</w:t>
-      </w:r>
-      <w:proofErr w:type="spellEnd"/>
-      <w:r>
-        <w:t xml:space="preserve"> communication layer</w:t>
+        <w:t>Stabilize vSTB communication layer</w:t>
       </w:r>
     </w:p>
     <w:p>
@@ -653,23 +633,7 @@
         </w:numPr>
       </w:pPr>
       <w:r>
-        <w:t xml:space="preserve">Network testing with timings and packets to see the limitations of communication layer on a LAN </w:t>
-      </w:r>
-      <w:proofErr w:type="spellStart"/>
-      <w:r>
-        <w:t>vSTB</w:t>
-      </w:r>
-      <w:proofErr w:type="spellEnd"/>
-      <w:r>
-        <w:t xml:space="preserve"> and WLAN </w:t>
-      </w:r>
-      <w:proofErr w:type="spellStart"/>
-      <w:r>
-        <w:t>vSTB</w:t>
-      </w:r>
-      <w:proofErr w:type="spellEnd"/>
-      <w:r>
-        <w:t xml:space="preserve"> within our sandbox environment.</w:t>
+        <w:t>Network testing with timings and packets to see the limitations of communication layer on a LAN vSTB and WLAN vSTB within our sandbox environment.</w:t>
       </w:r>
     </w:p>
     <w:p>
@@ -708,15 +672,7 @@
         </w:numPr>
       </w:pPr>
       <w:r>
-        <w:t xml:space="preserve">Provides </w:t>
-      </w:r>
-      <w:proofErr w:type="spellStart"/>
-      <w:r>
-        <w:t>vSTB</w:t>
-      </w:r>
-      <w:proofErr w:type="spellEnd"/>
-      <w:r>
-        <w:t xml:space="preserve"> Tester</w:t>
+        <w:t>Provides vSTB Tester</w:t>
       </w:r>
       <w:r>
         <w:t xml:space="preserve"> interface</w:t>
@@ -890,12 +846,10 @@
       <w:pPr>
         <w:pStyle w:val="Heading2"/>
       </w:pPr>
-      <w:proofErr w:type="spellStart"/>
       <w:proofErr w:type="gramStart"/>
       <w:r>
         <w:t>vAPMax</w:t>
       </w:r>
-      <w:proofErr w:type="spellEnd"/>
       <w:proofErr w:type="gramEnd"/>
     </w:p>
     <w:p>
@@ -1009,69 +963,38 @@
     </w:p>
     <w:p>
       <w:r>
-        <w:t xml:space="preserve">The only issues from a </w:t>
-      </w:r>
-      <w:proofErr w:type="spellStart"/>
+        <w:t>The only issues from a vSTB standpoint, is the idea of how to deploy the actual game logic to the vSTB from the Game Server. Our design should be able to deploy the logic to the vSTB and the vSTB will only be in charge of sending off the end turn move, while all the intermediate moves are managed by the game logic is stored locally on the vSTB during the lifespan of the game.</w:t>
+      </w:r>
+    </w:p>
+    <w:p>
+      <w:r>
+        <w:t>Some of the issues we had this sprint for the game server were integrating the serialization library, and getting the blowfish encryption right. The serialization library was a challenge because it was written by an employee who is no longer with the company and there was little documentation about it</w:t>
+      </w:r>
+      <w:r>
+        <w:t xml:space="preserve">. The encryption was a challenge because it had at first appeared to work. After a couple days of fiddling with the code on both ends of the communication chain did we realize that we were using the wrong </w:t>
+      </w:r>
+      <w:proofErr w:type="gramStart"/>
+      <w:r>
+        <w:t>implementation.</w:t>
+      </w:r>
+      <w:proofErr w:type="gramEnd"/>
+    </w:p>
+    <w:p>
+      <w:pPr>
+        <w:pStyle w:val="Heading1"/>
+      </w:pPr>
+      <w:r>
+        <w:t>Prototypes</w:t>
+      </w:r>
+    </w:p>
+    <w:p>
+      <w:pPr>
+        <w:pStyle w:val="Heading2"/>
+      </w:pPr>
+      <w:proofErr w:type="gramStart"/>
       <w:r>
         <w:t>vSTB</w:t>
       </w:r>
-      <w:proofErr w:type="spellEnd"/>
-      <w:r>
-        <w:t xml:space="preserve"> standpoint, is the idea of how to deploy the actual game logic to the </w:t>
-      </w:r>
-      <w:proofErr w:type="spellStart"/>
-      <w:r>
-        <w:t>vSTB</w:t>
-      </w:r>
-      <w:proofErr w:type="spellEnd"/>
-      <w:r>
-        <w:t xml:space="preserve"> from the Game Server. Our design should be able to deploy the logic to the </w:t>
-      </w:r>
-      <w:proofErr w:type="spellStart"/>
-      <w:r>
-        <w:t>vSTB</w:t>
-      </w:r>
-      <w:proofErr w:type="spellEnd"/>
-      <w:r>
-        <w:t xml:space="preserve"> and the </w:t>
-      </w:r>
-      <w:proofErr w:type="spellStart"/>
-      <w:r>
-        <w:t>vSTB</w:t>
-      </w:r>
-      <w:proofErr w:type="spellEnd"/>
-      <w:r>
-        <w:t xml:space="preserve"> will only be in charge of sending off the end turn move, while all the intermediate moves are managed by the game logic is stored locally on the </w:t>
-      </w:r>
-      <w:proofErr w:type="spellStart"/>
-      <w:r>
-        <w:t>vSTB</w:t>
-      </w:r>
-      <w:proofErr w:type="spellEnd"/>
-      <w:r>
-        <w:t xml:space="preserve"> during the lifespan of the game.</w:t>
-      </w:r>
-    </w:p>
-    <w:p>
-      <w:pPr>
-        <w:pStyle w:val="Heading1"/>
-      </w:pPr>
-      <w:r>
-        <w:t>Prototypes</w:t>
-      </w:r>
-      <w:bookmarkStart w:id="0" w:name="_GoBack"/>
-      <w:bookmarkEnd w:id="0"/>
-    </w:p>
-    <w:p>
-      <w:pPr>
-        <w:pStyle w:val="Heading2"/>
-      </w:pPr>
-      <w:proofErr w:type="spellStart"/>
-      <w:proofErr w:type="gramStart"/>
-      <w:r>
-        <w:t>vSTB</w:t>
-      </w:r>
-      <w:proofErr w:type="spellEnd"/>
       <w:proofErr w:type="gramEnd"/>
       <w:r>
         <w:t xml:space="preserve"> Tester</w:t>
@@ -1134,85 +1057,108 @@
     </w:p>
     <w:p>
       <w:r>
-        <w:t xml:space="preserve">The </w:t>
+        <w:t xml:space="preserve">The vSTB Tester will be designed for the </w:t>
       </w:r>
       <w:proofErr w:type="spellStart"/>
       <w:r>
+        <w:t>vAPMAX</w:t>
+      </w:r>
+      <w:proofErr w:type="spellEnd"/>
+      <w:r>
+        <w:t xml:space="preserve"> and Game Server to simplify communication testing of the sand box environment. This way they can test their new Command Link messages without having to </w:t>
+      </w:r>
+      <w:r>
+        <w:lastRenderedPageBreak/>
+        <w:t>have my vSTB up and running. More importantly it provides graphs and view/models of the incoming and outgoing messages so they no longer have to sit and read console output. The vSTB Tester will provide them with an intuitive tool that will speed up our overall development time across the sandbox environment.</w:t>
+      </w:r>
+    </w:p>
+    <w:p>
+      <w:pPr>
+        <w:pStyle w:val="Heading2"/>
+      </w:pPr>
+      <w:proofErr w:type="gramStart"/>
+      <w:r>
         <w:t>vSTB</w:t>
       </w:r>
+      <w:proofErr w:type="gramEnd"/>
+      <w:r>
+        <w:t xml:space="preserve"> Multiplayer Environment</w:t>
+      </w:r>
+    </w:p>
+    <w:p>
+      <w:r>
+        <w:t xml:space="preserve">The vSTB Multiplayer Environment is still in initial design phase but we do have some feasible ideas that can’t be confirmed until we stabilize the communication layer between the vSTB, </w:t>
+      </w:r>
+      <w:proofErr w:type="spellStart"/>
+      <w:r>
+        <w:t>vAPMAX</w:t>
+      </w:r>
       <w:proofErr w:type="spellEnd"/>
       <w:r>
-        <w:t xml:space="preserve"> Tester will be designed for the </w:t>
-      </w:r>
-      <w:proofErr w:type="spellStart"/>
-      <w:r>
-        <w:t>vAPMAX</w:t>
-      </w:r>
-      <w:proofErr w:type="spellEnd"/>
-      <w:r>
-        <w:t xml:space="preserve"> and Game Server to simplify communication testing of the sand box environment. This way they can test their new Command Link messages without having to have my </w:t>
-      </w:r>
-      <w:proofErr w:type="spellStart"/>
-      <w:r>
-        <w:t>vSTB</w:t>
-      </w:r>
-      <w:proofErr w:type="spellEnd"/>
-      <w:r>
-        <w:t xml:space="preserve"> up and running. More importantly it provides graphs and view/models of the incoming and outgoing messages so they no longer have to sit and read console output. The </w:t>
-      </w:r>
-      <w:proofErr w:type="spellStart"/>
-      <w:r>
-        <w:t>vSTB</w:t>
-      </w:r>
-      <w:proofErr w:type="spellEnd"/>
-      <w:r>
-        <w:t xml:space="preserve"> Tester will provide them with an intuitive tool that will speed up our overall development time across the sandbox environment.</w:t>
+        <w:t>, and the Game Server. Once we know the limitations of the communication layer we can then refine our design to actually be testable inside the sandbox environment.</w:t>
       </w:r>
     </w:p>
     <w:p>
       <w:pPr>
         <w:pStyle w:val="Heading2"/>
       </w:pPr>
-      <w:proofErr w:type="spellStart"/>
-      <w:proofErr w:type="gramStart"/>
-      <w:r>
-        <w:lastRenderedPageBreak/>
-        <w:t>vSTB</w:t>
-      </w:r>
-      <w:proofErr w:type="spellEnd"/>
-      <w:proofErr w:type="gramEnd"/>
-      <w:r>
-        <w:t xml:space="preserve"> Multiplayer Environment</w:t>
-      </w:r>
-    </w:p>
-    <w:p>
-      <w:r>
-        <w:t xml:space="preserve">The </w:t>
-      </w:r>
-      <w:proofErr w:type="spellStart"/>
-      <w:r>
-        <w:t>vSTB</w:t>
-      </w:r>
-      <w:proofErr w:type="spellEnd"/>
-      <w:r>
-        <w:t xml:space="preserve"> Multiplayer Environment is still in initial design phase but we do have some feasible ideas that can’t be confirmed until we stabilize the communication layer between the </w:t>
-      </w:r>
-      <w:proofErr w:type="spellStart"/>
-      <w:r>
-        <w:t>vSTB</w:t>
-      </w:r>
-      <w:proofErr w:type="spellEnd"/>
-      <w:r>
-        <w:t xml:space="preserve">, </w:t>
-      </w:r>
-      <w:proofErr w:type="spellStart"/>
-      <w:r>
-        <w:t>vAPMAX</w:t>
-      </w:r>
-      <w:proofErr w:type="spellEnd"/>
-      <w:r>
-        <w:t>, and the Game Server. Once we know the limitations of the communication layer we can then refine our design to actually be testable inside the sandbox environment.</w:t>
-      </w:r>
+      <w:r>
+        <w:t>Game Server</w:t>
+      </w:r>
+    </w:p>
+    <w:p>
+      <w:r>
+        <w:t>The current game server prototype only supports communication. We felt that before we could move onto the more complicated portions of the project, we had to be confident in the stability of the communication. Because of this, the game server doesn’t do a whole lot at the moment. But what it does do, it does well. The UI on the prototype is not how it will look when the project is done, it is constructed as it is for the moment so that it can be more easily used to debug and shore up our communication.</w:t>
+      </w:r>
+    </w:p>
+    <w:p>
+      <w:r>
+        <w:drawing>
+          <wp:inline distT="0" distB="0" distL="0" distR="0" wp14:anchorId="283F9546" wp14:editId="2A4E5EDF">
+            <wp:extent cx="5126522" cy="3497089"/>
+            <wp:effectExtent l="0" t="0" r="0" b="8255"/>
+            <wp:docPr id="6" name="Content Placeholder 5"/>
+            <wp:cNvGraphicFramePr>
+              <a:graphicFrameLocks xmlns:a="http://schemas.openxmlformats.org/drawingml/2006/main" noGrp="1" noChangeAspect="1"/>
+            </wp:cNvGraphicFramePr>
+            <a:graphic xmlns:a="http://schemas.openxmlformats.org/drawingml/2006/main">
+              <a:graphicData uri="http://schemas.openxmlformats.org/drawingml/2006/picture">
+                <pic:pic xmlns:pic="http://schemas.openxmlformats.org/drawingml/2006/picture">
+                  <pic:nvPicPr>
+                    <pic:cNvPr id="6" name="Content Placeholder 5"/>
+                    <pic:cNvPicPr>
+                      <a:picLocks noGrp="1" noChangeAspect="1"/>
+                    </pic:cNvPicPr>
+                  </pic:nvPicPr>
+                  <pic:blipFill>
+                    <a:blip r:embed="rId8">
+                      <a:extLst>
+                        <a:ext uri="{28A0092B-C50C-407E-A947-70E740481C1C}">
+                          <a14:useLocalDpi xmlns:a14="http://schemas.microsoft.com/office/drawing/2010/main" val="0"/>
+                        </a:ext>
+                      </a:extLst>
+                    </a:blip>
+                    <a:stretch>
+                      <a:fillRect/>
+                    </a:stretch>
+                  </pic:blipFill>
+                  <pic:spPr>
+                    <a:xfrm>
+                      <a:off x="0" y="0"/>
+                      <a:ext cx="5126522" cy="3497089"/>
+                    </a:xfrm>
+                    <a:prstGeom prst="rect">
+                      <a:avLst/>
+                    </a:prstGeom>
+                  </pic:spPr>
+                </pic:pic>
+              </a:graphicData>
+            </a:graphic>
+          </wp:inline>
+        </w:drawing>
+      </w:r>
+      <w:bookmarkStart w:id="0" w:name="_GoBack"/>
+      <w:bookmarkEnd w:id="0"/>
     </w:p>
     <w:sectPr>
       <w:pgSz w:w="12240" w:h="15840"/>
@@ -2357,7 +2303,6 @@
   <w:style w:type="character" w:default="1" w:styleId="DefaultParagraphFont">
     <w:name w:val="Default Paragraph Font"/>
     <w:uiPriority w:val="1"/>
-    <w:semiHidden/>
     <w:unhideWhenUsed/>
   </w:style>
   <w:style w:type="table" w:default="1" w:styleId="TableNormal">
@@ -2778,7 +2723,6 @@
   <w:style w:type="character" w:default="1" w:styleId="DefaultParagraphFont">
     <w:name w:val="Default Paragraph Font"/>
     <w:uiPriority w:val="1"/>
-    <w:semiHidden/>
     <w:unhideWhenUsed/>
   </w:style>
   <w:style w:type="table" w:default="1" w:styleId="TableNormal">
@@ -3257,7 +3201,7 @@
 </file>
 
 <file path=customXml/itemProps1.xml><?xml version="1.0" encoding="utf-8"?>
-<ds:datastoreItem xmlns:ds="http://schemas.openxmlformats.org/officeDocument/2006/customXml" ds:itemID="{B3B3510B-7511-4C7F-82C7-DF36A93D7328}">
+<ds:datastoreItem xmlns:ds="http://schemas.openxmlformats.org/officeDocument/2006/customXml" ds:itemID="{297FC0C7-018C-4F0F-B67E-99FDF8C11D31}">
   <ds:schemaRefs>
     <ds:schemaRef ds:uri="http://schemas.openxmlformats.org/officeDocument/2006/bibliography"/>
   </ds:schemaRefs>

</xml_diff>

<commit_message>
updated sprint 3 report with more vstb info
</commit_message>
<xml_diff>
--- a/docs/srDesign_SprintReport3.docx
+++ b/docs/srDesign_SprintReport3.docx
@@ -282,6 +282,9 @@
       <w:r>
         <w:t>TCP</w:t>
       </w:r>
+      <w:r>
+        <w:t xml:space="preserve"> (due to the scope of multiplayer environment we have not had a need to fully implement TCP messages)</w:t>
+      </w:r>
     </w:p>
     <w:p>
       <w:pPr>
@@ -510,6 +513,7 @@
         </w:numPr>
       </w:pPr>
       <w:r>
+        <w:lastRenderedPageBreak/>
         <w:t>Encrypt message</w:t>
       </w:r>
     </w:p>
@@ -522,7 +526,6 @@
         </w:numPr>
       </w:pPr>
       <w:r>
-        <w:lastRenderedPageBreak/>
         <w:t>Update current code to use latest Reactive Extension package</w:t>
       </w:r>
     </w:p>
@@ -596,6 +599,34 @@
     </w:p>
     <w:p>
       <w:pPr>
+        <w:pStyle w:val="ListParagraph"/>
+        <w:numPr>
+          <w:ilvl w:val="0"/>
+          <w:numId w:val="5"/>
+        </w:numPr>
+      </w:pPr>
+      <w:r>
+        <w:t xml:space="preserve">Begin stress tests on communication layer between </w:t>
+      </w:r>
+      <w:proofErr w:type="spellStart"/>
+      <w:r>
+        <w:t>vSTB</w:t>
+      </w:r>
+      <w:proofErr w:type="spellEnd"/>
+      <w:r>
+        <w:t xml:space="preserve">, </w:t>
+      </w:r>
+      <w:proofErr w:type="spellStart"/>
+      <w:r>
+        <w:t>vAPMAX</w:t>
+      </w:r>
+      <w:proofErr w:type="spellEnd"/>
+      <w:r>
+        <w:t>, and Game Server</w:t>
+      </w:r>
+    </w:p>
+    <w:p>
+      <w:pPr>
         <w:pStyle w:val="Heading1"/>
       </w:pPr>
       <w:r>
@@ -844,6 +875,77 @@
     </w:p>
     <w:p>
       <w:pPr>
+        <w:pStyle w:val="ListParagraph"/>
+        <w:numPr>
+          <w:ilvl w:val="0"/>
+          <w:numId w:val="10"/>
+        </w:numPr>
+      </w:pPr>
+      <w:r>
+        <w:t xml:space="preserve">Implement </w:t>
+      </w:r>
+      <w:proofErr w:type="spellStart"/>
+      <w:r>
+        <w:t>Wireshark</w:t>
+      </w:r>
+      <w:proofErr w:type="spellEnd"/>
+      <w:r>
+        <w:t xml:space="preserve"> dissector plugin </w:t>
+      </w:r>
+      <w:r>
+        <w:t>(research phase)</w:t>
+      </w:r>
+    </w:p>
+    <w:p>
+      <w:pPr>
+        <w:pStyle w:val="ListParagraph"/>
+        <w:numPr>
+          <w:ilvl w:val="1"/>
+          <w:numId w:val="10"/>
+        </w:numPr>
+      </w:pPr>
+      <w:r>
+        <w:t>Provides extensive tool to generate network statistics documentation on the fly using Cascade Pilot software</w:t>
+      </w:r>
+    </w:p>
+    <w:p>
+      <w:pPr>
+        <w:pStyle w:val="ListParagraph"/>
+        <w:numPr>
+          <w:ilvl w:val="1"/>
+          <w:numId w:val="10"/>
+        </w:numPr>
+      </w:pPr>
+      <w:r>
+        <w:t>Reduces development time of writing all network tests and graph</w:t>
+      </w:r>
+      <w:r>
+        <w:t>s</w:t>
+      </w:r>
+      <w:r>
+        <w:t xml:space="preserve"> from scratch</w:t>
+      </w:r>
+    </w:p>
+    <w:p>
+      <w:pPr>
+        <w:pStyle w:val="ListParagraph"/>
+        <w:numPr>
+          <w:ilvl w:val="1"/>
+          <w:numId w:val="10"/>
+        </w:numPr>
+      </w:pPr>
+      <w:r>
+        <w:t xml:space="preserve">The plugin can work for all Innovative System’s network communication protocols across tiers. Additionally it provides actual tests and documentation to support the features of our STBMF system. More importantly provide tractability to our </w:t>
+      </w:r>
+      <w:r>
+        <w:lastRenderedPageBreak/>
+        <w:t>requirements to ensure stability of a proof of concept product that may or may not go into production in the future.</w:t>
+      </w:r>
+      <w:bookmarkStart w:id="0" w:name="_GoBack"/>
+      <w:bookmarkEnd w:id="0"/>
+    </w:p>
+    <w:p>
+      <w:pPr>
         <w:pStyle w:val="Heading2"/>
       </w:pPr>
       <w:proofErr w:type="gramStart"/>
@@ -910,7 +1012,6 @@
         </w:numPr>
       </w:pPr>
       <w:r>
-        <w:lastRenderedPageBreak/>
         <w:t>Sending to multiple STBs</w:t>
       </w:r>
     </w:p>
@@ -984,6 +1085,7 @@
         <w:pStyle w:val="Heading1"/>
       </w:pPr>
       <w:r>
+        <w:lastRenderedPageBreak/>
         <w:t>Prototypes</w:t>
       </w:r>
     </w:p>
@@ -1065,54 +1167,62 @@
       </w:r>
       <w:proofErr w:type="spellEnd"/>
       <w:r>
-        <w:t xml:space="preserve"> and Game Server to simplify communication testing of the sand box environment. This way they can test their new Command Link messages without having to </w:t>
-      </w:r>
-      <w:r>
+        <w:t xml:space="preserve"> and Game Server to simplify communication testing of the sand box environment. This way they can test their new Command Link messages without having to have my vSTB up and running. More importantly it provides graphs and view/models of the incoming and outgoing messages so they no longer have to sit and read console output. The vSTB Tester will provide them with an intuitive tool that will speed up our overall development time across the sandbox environment.</w:t>
+      </w:r>
+    </w:p>
+    <w:p>
+      <w:pPr>
+        <w:pStyle w:val="Heading2"/>
+      </w:pPr>
+      <w:proofErr w:type="gramStart"/>
+      <w:r>
+        <w:t>vSTB</w:t>
+      </w:r>
+      <w:proofErr w:type="gramEnd"/>
+      <w:r>
+        <w:t xml:space="preserve"> Multiplayer Environment</w:t>
+      </w:r>
+    </w:p>
+    <w:p>
+      <w:r>
+        <w:t xml:space="preserve">The vSTB Multiplayer Environment is still in initial design phase but we do have some feasible ideas that can’t be confirmed until we stabilize the communication layer between the </w:t>
+      </w:r>
+      <w:proofErr w:type="spellStart"/>
+      <w:r>
+        <w:t>vSTB</w:t>
+      </w:r>
+      <w:proofErr w:type="spellEnd"/>
+      <w:r>
+        <w:t xml:space="preserve">, </w:t>
+      </w:r>
+      <w:proofErr w:type="spellStart"/>
+      <w:r>
+        <w:t>vAPMAX</w:t>
+      </w:r>
+      <w:proofErr w:type="spellEnd"/>
+      <w:r>
+        <w:t>, and the Game Server. Once we know the limitations of the communication layer we can then refine our design to actually be testable inside the sandbox environment.</w:t>
+      </w:r>
+    </w:p>
+    <w:p>
+      <w:pPr>
+        <w:pStyle w:val="Heading2"/>
+      </w:pPr>
+      <w:r>
+        <w:t>Game Server</w:t>
+      </w:r>
+    </w:p>
+    <w:p>
+      <w:r>
+        <w:t>The current game server prototype only supports communication. We felt that before we could move onto the more complicated portions of the project, we had to be confident in the stability of the communication. Because of this, the game server doesn’t do a whole lot at the moment. But what it does do, it does well. The UI on the prototype is not how it will look when the project is done, it is constructed as it is for the moment so that it can be more easily used to debug and shore up our communication.</w:t>
+      </w:r>
+    </w:p>
+    <w:p>
+      <w:r>
+        <w:rPr>
+          <w:noProof/>
+        </w:rPr>
         <w:lastRenderedPageBreak/>
-        <w:t>have my vSTB up and running. More importantly it provides graphs and view/models of the incoming and outgoing messages so they no longer have to sit and read console output. The vSTB Tester will provide them with an intuitive tool that will speed up our overall development time across the sandbox environment.</w:t>
-      </w:r>
-    </w:p>
-    <w:p>
-      <w:pPr>
-        <w:pStyle w:val="Heading2"/>
-      </w:pPr>
-      <w:proofErr w:type="gramStart"/>
-      <w:r>
-        <w:t>vSTB</w:t>
-      </w:r>
-      <w:proofErr w:type="gramEnd"/>
-      <w:r>
-        <w:t xml:space="preserve"> Multiplayer Environment</w:t>
-      </w:r>
-    </w:p>
-    <w:p>
-      <w:r>
-        <w:t xml:space="preserve">The vSTB Multiplayer Environment is still in initial design phase but we do have some feasible ideas that can’t be confirmed until we stabilize the communication layer between the vSTB, </w:t>
-      </w:r>
-      <w:proofErr w:type="spellStart"/>
-      <w:r>
-        <w:t>vAPMAX</w:t>
-      </w:r>
-      <w:proofErr w:type="spellEnd"/>
-      <w:r>
-        <w:t>, and the Game Server. Once we know the limitations of the communication layer we can then refine our design to actually be testable inside the sandbox environment.</w:t>
-      </w:r>
-    </w:p>
-    <w:p>
-      <w:pPr>
-        <w:pStyle w:val="Heading2"/>
-      </w:pPr>
-      <w:r>
-        <w:t>Game Server</w:t>
-      </w:r>
-    </w:p>
-    <w:p>
-      <w:r>
-        <w:t>The current game server prototype only supports communication. We felt that before we could move onto the more complicated portions of the project, we had to be confident in the stability of the communication. Because of this, the game server doesn’t do a whole lot at the moment. But what it does do, it does well. The UI on the prototype is not how it will look when the project is done, it is constructed as it is for the moment so that it can be more easily used to debug and shore up our communication.</w:t>
-      </w:r>
-    </w:p>
-    <w:p>
-      <w:r>
         <w:drawing>
           <wp:inline distT="0" distB="0" distL="0" distR="0" wp14:anchorId="283F9546" wp14:editId="2A4E5EDF">
             <wp:extent cx="5126522" cy="3497089"/>
@@ -1157,8 +1267,6 @@
           </wp:inline>
         </w:drawing>
       </w:r>
-      <w:bookmarkStart w:id="0" w:name="_GoBack"/>
-      <w:bookmarkEnd w:id="0"/>
     </w:p>
     <w:sectPr>
       <w:pgSz w:w="12240" w:h="15840"/>
@@ -2303,6 +2411,7 @@
   <w:style w:type="character" w:default="1" w:styleId="DefaultParagraphFont">
     <w:name w:val="Default Paragraph Font"/>
     <w:uiPriority w:val="1"/>
+    <w:semiHidden/>
     <w:unhideWhenUsed/>
   </w:style>
   <w:style w:type="table" w:default="1" w:styleId="TableNormal">
@@ -2723,6 +2832,7 @@
   <w:style w:type="character" w:default="1" w:styleId="DefaultParagraphFont">
     <w:name w:val="Default Paragraph Font"/>
     <w:uiPriority w:val="1"/>
+    <w:semiHidden/>
     <w:unhideWhenUsed/>
   </w:style>
   <w:style w:type="table" w:default="1" w:styleId="TableNormal">
@@ -3201,7 +3311,7 @@
 </file>
 
 <file path=customXml/itemProps1.xml><?xml version="1.0" encoding="utf-8"?>
-<ds:datastoreItem xmlns:ds="http://schemas.openxmlformats.org/officeDocument/2006/customXml" ds:itemID="{297FC0C7-018C-4F0F-B67E-99FDF8C11D31}">
+<ds:datastoreItem xmlns:ds="http://schemas.openxmlformats.org/officeDocument/2006/customXml" ds:itemID="{43DCDC71-6238-467A-B31B-CD08A830D706}">
   <ds:schemaRefs>
     <ds:schemaRef ds:uri="http://schemas.openxmlformats.org/officeDocument/2006/bibliography"/>
   </ds:schemaRefs>

</xml_diff>

<commit_message>
Added vAPMax prototype to sprint report 3
</commit_message>
<xml_diff>
--- a/docs/srDesign_SprintReport3.docx
+++ b/docs/srDesign_SprintReport3.docx
@@ -105,15 +105,7 @@
         </w:numPr>
       </w:pPr>
       <w:r>
-        <w:t xml:space="preserve">Send </w:t>
-      </w:r>
-      <w:proofErr w:type="spellStart"/>
-      <w:r>
-        <w:t>CommandLink</w:t>
-      </w:r>
-      <w:proofErr w:type="spellEnd"/>
-      <w:r>
-        <w:t xml:space="preserve"> messages</w:t>
+        <w:t>Send CommandLink messages</w:t>
       </w:r>
     </w:p>
     <w:p>
@@ -188,15 +180,7 @@
         </w:numPr>
       </w:pPr>
       <w:r>
-        <w:t xml:space="preserve">Receive </w:t>
-      </w:r>
-      <w:proofErr w:type="spellStart"/>
-      <w:r>
-        <w:t>CommandLink</w:t>
-      </w:r>
-      <w:proofErr w:type="spellEnd"/>
-      <w:r>
-        <w:t xml:space="preserve"> messages</w:t>
+        <w:t>Receive CommandLink messages</w:t>
       </w:r>
     </w:p>
     <w:p>
@@ -339,15 +323,7 @@
         </w:numPr>
       </w:pPr>
       <w:r>
-        <w:t xml:space="preserve">Integrate </w:t>
-      </w:r>
-      <w:proofErr w:type="spellStart"/>
-      <w:r>
-        <w:t>BinarySerializer</w:t>
-      </w:r>
-      <w:proofErr w:type="spellEnd"/>
-      <w:r>
-        <w:t xml:space="preserve"> library</w:t>
+        <w:t>Integrate BinarySerializer library</w:t>
       </w:r>
     </w:p>
     <w:p>
@@ -359,15 +335,7 @@
         </w:numPr>
       </w:pPr>
       <w:r>
-        <w:t xml:space="preserve">Create a </w:t>
-      </w:r>
-      <w:proofErr w:type="spellStart"/>
-      <w:r>
-        <w:t>BinarySerializer</w:t>
-      </w:r>
-      <w:proofErr w:type="spellEnd"/>
-      <w:r>
-        <w:t xml:space="preserve"> compliant class</w:t>
+        <w:t>Create a BinarySerializer compliant class</w:t>
       </w:r>
       <w:r>
         <w:t xml:space="preserve"> for each message</w:t>
@@ -606,15 +574,7 @@
         </w:numPr>
       </w:pPr>
       <w:r>
-        <w:t xml:space="preserve">Begin stress tests on communication layer between </w:t>
-      </w:r>
-      <w:proofErr w:type="spellStart"/>
-      <w:r>
-        <w:t>vSTB</w:t>
-      </w:r>
-      <w:proofErr w:type="spellEnd"/>
-      <w:r>
-        <w:t xml:space="preserve">, </w:t>
+        <w:t xml:space="preserve">Begin stress tests on communication layer between vSTB, </w:t>
       </w:r>
       <w:proofErr w:type="spellStart"/>
       <w:r>
@@ -941,8 +901,6 @@
         <w:lastRenderedPageBreak/>
         <w:t>requirements to ensure stability of a proof of concept product that may or may not go into production in the future.</w:t>
       </w:r>
-      <w:bookmarkStart w:id="0" w:name="_GoBack"/>
-      <w:bookmarkEnd w:id="0"/>
     </w:p>
     <w:p>
       <w:pPr>
@@ -1185,24 +1143,119 @@
     </w:p>
     <w:p>
       <w:r>
-        <w:t xml:space="preserve">The vSTB Multiplayer Environment is still in initial design phase but we do have some feasible ideas that can’t be confirmed until we stabilize the communication layer between the </w:t>
+        <w:t xml:space="preserve">The vSTB Multiplayer Environment is still in initial design phase but we do have some feasible ideas that can’t be confirmed until we stabilize the communication layer between the vSTB, </w:t>
       </w:r>
       <w:proofErr w:type="spellStart"/>
       <w:r>
-        <w:t>vSTB</w:t>
+        <w:t>vAPMAX</w:t>
       </w:r>
       <w:proofErr w:type="spellEnd"/>
       <w:r>
-        <w:t xml:space="preserve">, </w:t>
+        <w:t>, and the Game Server. Once we know the limitations of the communication layer we can then refine our design to actually be testable inside the sandbox environment.</w:t>
+      </w:r>
+    </w:p>
+    <w:p>
+      <w:pPr>
+        <w:pStyle w:val="Heading2"/>
+      </w:pPr>
+      <w:proofErr w:type="gramStart"/>
+      <w:r>
+        <w:lastRenderedPageBreak/>
+        <w:t>vAPMax</w:t>
+      </w:r>
+      <w:proofErr w:type="gramEnd"/>
+    </w:p>
+    <w:p>
+      <w:r>
+        <w:rPr>
+          <w:noProof/>
+        </w:rPr>
+        <w:drawing>
+          <wp:inline distT="0" distB="0" distL="0" distR="0" wp14:anchorId="0A4C2712" wp14:editId="26839CEE">
+            <wp:extent cx="5024580" cy="5019212"/>
+            <wp:effectExtent l="0" t="0" r="5080" b="0"/>
+            <wp:docPr id="2" name="Picture 2"/>
+            <wp:cNvGraphicFramePr>
+              <a:graphicFrameLocks xmlns:a="http://schemas.openxmlformats.org/drawingml/2006/main" noChangeAspect="1"/>
+            </wp:cNvGraphicFramePr>
+            <a:graphic xmlns:a="http://schemas.openxmlformats.org/drawingml/2006/main">
+              <a:graphicData uri="http://schemas.openxmlformats.org/drawingml/2006/picture">
+                <pic:pic xmlns:pic="http://schemas.openxmlformats.org/drawingml/2006/picture">
+                  <pic:nvPicPr>
+                    <pic:cNvPr id="0" name="vAPMax Demo Screenshot.png"/>
+                    <pic:cNvPicPr/>
+                  </pic:nvPicPr>
+                  <pic:blipFill>
+                    <a:blip r:embed="rId8">
+                      <a:extLst>
+                        <a:ext uri="{28A0092B-C50C-407E-A947-70E740481C1C}">
+                          <a14:useLocalDpi xmlns:a14="http://schemas.microsoft.com/office/drawing/2010/main" val="0"/>
+                        </a:ext>
+                      </a:extLst>
+                    </a:blip>
+                    <a:stretch>
+                      <a:fillRect/>
+                    </a:stretch>
+                  </pic:blipFill>
+                  <pic:spPr>
+                    <a:xfrm>
+                      <a:off x="0" y="0"/>
+                      <a:ext cx="5022303" cy="5016937"/>
+                    </a:xfrm>
+                    <a:prstGeom prst="rect">
+                      <a:avLst/>
+                    </a:prstGeom>
+                  </pic:spPr>
+                </pic:pic>
+              </a:graphicData>
+            </a:graphic>
+          </wp:inline>
+        </w:drawing>
+      </w:r>
+    </w:p>
+    <w:p>
+      <w:r>
+        <w:t xml:space="preserve">The vAPMax is used to simulate command link message relaying of the actual APMax. During this sprint, David finished up implementing the vAPMax to handle incoming and outgoing UDP and TCP packets. </w:t>
+      </w:r>
+    </w:p>
+    <w:p>
+      <w:r>
+        <w:t>There are only a couple of small tasks left with the vAPMax which include:</w:t>
+      </w:r>
+    </w:p>
+    <w:p>
+      <w:pPr>
+        <w:pStyle w:val="ListParagraph"/>
+        <w:numPr>
+          <w:ilvl w:val="0"/>
+          <w:numId w:val="11"/>
+        </w:numPr>
+      </w:pPr>
+      <w:r>
+        <w:t>Upgrade Rx package to latest</w:t>
+      </w:r>
+    </w:p>
+    <w:p>
+      <w:pPr>
+        <w:pStyle w:val="ListParagraph"/>
+        <w:numPr>
+          <w:ilvl w:val="0"/>
+          <w:numId w:val="11"/>
+        </w:numPr>
+      </w:pPr>
+      <w:r>
+        <w:t xml:space="preserve">Combine the two existing </w:t>
       </w:r>
       <w:proofErr w:type="spellStart"/>
       <w:r>
-        <w:t>vAPMAX</w:t>
+        <w:t>Tcp</w:t>
       </w:r>
       <w:proofErr w:type="spellEnd"/>
       <w:r>
-        <w:t>, and the Game Server. Once we know the limitations of the communication layer we can then refine our design to actually be testable inside the sandbox environment.</w:t>
-      </w:r>
+        <w:t xml:space="preserve"> ports into one port and process based on message type</w:t>
+      </w:r>
+      <w:bookmarkStart w:id="0" w:name="_GoBack"/>
+      <w:bookmarkEnd w:id="0"/>
     </w:p>
     <w:p>
       <w:pPr>
@@ -1241,7 +1294,7 @@
                     </pic:cNvPicPr>
                   </pic:nvPicPr>
                   <pic:blipFill>
-                    <a:blip r:embed="rId8">
+                    <a:blip r:embed="rId9">
                       <a:extLst>
                         <a:ext uri="{28A0092B-C50C-407E-A947-70E740481C1C}">
                           <a14:useLocalDpi xmlns:a14="http://schemas.microsoft.com/office/drawing/2010/main" val="0"/>
@@ -1542,6 +1595,92 @@
     </w:lvl>
   </w:abstractNum>
   <w:abstractNum w:abstractNumId="3">
+    <w:nsid w:val="1FB112AC"/>
+    <w:multiLevelType w:val="multilevel"/>
+    <w:tmpl w:val="0409001F"/>
+    <w:lvl w:ilvl="0">
+      <w:start w:val="1"/>
+      <w:numFmt w:val="decimal"/>
+      <w:lvlText w:val="%1."/>
+      <w:lvlJc w:val="left"/>
+      <w:pPr>
+        <w:ind w:left="360" w:hanging="360"/>
+      </w:pPr>
+    </w:lvl>
+    <w:lvl w:ilvl="1">
+      <w:start w:val="1"/>
+      <w:numFmt w:val="decimal"/>
+      <w:lvlText w:val="%1.%2."/>
+      <w:lvlJc w:val="left"/>
+      <w:pPr>
+        <w:ind w:left="792" w:hanging="432"/>
+      </w:pPr>
+    </w:lvl>
+    <w:lvl w:ilvl="2">
+      <w:start w:val="1"/>
+      <w:numFmt w:val="decimal"/>
+      <w:lvlText w:val="%1.%2.%3."/>
+      <w:lvlJc w:val="left"/>
+      <w:pPr>
+        <w:ind w:left="1224" w:hanging="504"/>
+      </w:pPr>
+    </w:lvl>
+    <w:lvl w:ilvl="3">
+      <w:start w:val="1"/>
+      <w:numFmt w:val="decimal"/>
+      <w:lvlText w:val="%1.%2.%3.%4."/>
+      <w:lvlJc w:val="left"/>
+      <w:pPr>
+        <w:ind w:left="1728" w:hanging="648"/>
+      </w:pPr>
+    </w:lvl>
+    <w:lvl w:ilvl="4">
+      <w:start w:val="1"/>
+      <w:numFmt w:val="decimal"/>
+      <w:lvlText w:val="%1.%2.%3.%4.%5."/>
+      <w:lvlJc w:val="left"/>
+      <w:pPr>
+        <w:ind w:left="2232" w:hanging="792"/>
+      </w:pPr>
+    </w:lvl>
+    <w:lvl w:ilvl="5">
+      <w:start w:val="1"/>
+      <w:numFmt w:val="decimal"/>
+      <w:lvlText w:val="%1.%2.%3.%4.%5.%6."/>
+      <w:lvlJc w:val="left"/>
+      <w:pPr>
+        <w:ind w:left="2736" w:hanging="936"/>
+      </w:pPr>
+    </w:lvl>
+    <w:lvl w:ilvl="6">
+      <w:start w:val="1"/>
+      <w:numFmt w:val="decimal"/>
+      <w:lvlText w:val="%1.%2.%3.%4.%5.%6.%7."/>
+      <w:lvlJc w:val="left"/>
+      <w:pPr>
+        <w:ind w:left="3240" w:hanging="1080"/>
+      </w:pPr>
+    </w:lvl>
+    <w:lvl w:ilvl="7">
+      <w:start w:val="1"/>
+      <w:numFmt w:val="decimal"/>
+      <w:lvlText w:val="%1.%2.%3.%4.%5.%6.%7.%8."/>
+      <w:lvlJc w:val="left"/>
+      <w:pPr>
+        <w:ind w:left="3744" w:hanging="1224"/>
+      </w:pPr>
+    </w:lvl>
+    <w:lvl w:ilvl="8">
+      <w:start w:val="1"/>
+      <w:numFmt w:val="decimal"/>
+      <w:lvlText w:val="%1.%2.%3.%4.%5.%6.%7.%8.%9."/>
+      <w:lvlJc w:val="left"/>
+      <w:pPr>
+        <w:ind w:left="4320" w:hanging="1440"/>
+      </w:pPr>
+    </w:lvl>
+  </w:abstractNum>
+  <w:abstractNum w:abstractNumId="4">
     <w:nsid w:val="27CC759B"/>
     <w:multiLevelType w:val="multilevel"/>
     <w:tmpl w:val="0409001F"/>
@@ -1627,7 +1766,7 @@
       </w:pPr>
     </w:lvl>
   </w:abstractNum>
-  <w:abstractNum w:abstractNumId="4">
+  <w:abstractNum w:abstractNumId="5">
     <w:nsid w:val="381D7F9A"/>
     <w:multiLevelType w:val="multilevel"/>
     <w:tmpl w:val="0409001F"/>
@@ -1713,7 +1852,7 @@
       </w:pPr>
     </w:lvl>
   </w:abstractNum>
-  <w:abstractNum w:abstractNumId="5">
+  <w:abstractNum w:abstractNumId="6">
     <w:nsid w:val="4078065E"/>
     <w:multiLevelType w:val="hybridMultilevel"/>
     <w:tmpl w:val="1AE66632"/>
@@ -1802,7 +1941,7 @@
       </w:pPr>
     </w:lvl>
   </w:abstractNum>
-  <w:abstractNum w:abstractNumId="6">
+  <w:abstractNum w:abstractNumId="7">
     <w:nsid w:val="477358FC"/>
     <w:multiLevelType w:val="multilevel"/>
     <w:tmpl w:val="0409001F"/>
@@ -1888,7 +2027,7 @@
       </w:pPr>
     </w:lvl>
   </w:abstractNum>
-  <w:abstractNum w:abstractNumId="7">
+  <w:abstractNum w:abstractNumId="8">
     <w:nsid w:val="6B376063"/>
     <w:multiLevelType w:val="multilevel"/>
     <w:tmpl w:val="0409001F"/>
@@ -1974,7 +2113,7 @@
       </w:pPr>
     </w:lvl>
   </w:abstractNum>
-  <w:abstractNum w:abstractNumId="8">
+  <w:abstractNum w:abstractNumId="9">
     <w:nsid w:val="6CA70939"/>
     <w:multiLevelType w:val="multilevel"/>
     <w:tmpl w:val="0409001F"/>
@@ -2060,7 +2199,7 @@
       </w:pPr>
     </w:lvl>
   </w:abstractNum>
-  <w:abstractNum w:abstractNumId="9">
+  <w:abstractNum w:abstractNumId="10">
     <w:nsid w:val="7D921D0E"/>
     <w:multiLevelType w:val="hybridMultilevel"/>
     <w:tmpl w:val="C1BCCF96"/>
@@ -2147,13 +2286,13 @@
     </w:lvl>
   </w:abstractNum>
   <w:num w:numId="1">
-    <w:abstractNumId w:val="4"/>
+    <w:abstractNumId w:val="5"/>
   </w:num>
   <w:num w:numId="2">
-    <w:abstractNumId w:val="6"/>
+    <w:abstractNumId w:val="7"/>
   </w:num>
   <w:num w:numId="3">
-    <w:abstractNumId w:val="3"/>
+    <w:abstractNumId w:val="4"/>
   </w:num>
   <w:num w:numId="4">
     <w:abstractNumId w:val="2"/>
@@ -2162,19 +2301,22 @@
     <w:abstractNumId w:val="1"/>
   </w:num>
   <w:num w:numId="6">
-    <w:abstractNumId w:val="7"/>
+    <w:abstractNumId w:val="8"/>
   </w:num>
   <w:num w:numId="7">
-    <w:abstractNumId w:val="8"/>
+    <w:abstractNumId w:val="9"/>
   </w:num>
   <w:num w:numId="8">
     <w:abstractNumId w:val="0"/>
   </w:num>
   <w:num w:numId="9">
-    <w:abstractNumId w:val="9"/>
+    <w:abstractNumId w:val="10"/>
   </w:num>
   <w:num w:numId="10">
-    <w:abstractNumId w:val="5"/>
+    <w:abstractNumId w:val="6"/>
+  </w:num>
+  <w:num w:numId="11">
+    <w:abstractNumId w:val="3"/>
   </w:num>
 </w:numbering>
 </file>
@@ -3311,7 +3453,7 @@
 </file>
 
 <file path=customXml/itemProps1.xml><?xml version="1.0" encoding="utf-8"?>
-<ds:datastoreItem xmlns:ds="http://schemas.openxmlformats.org/officeDocument/2006/customXml" ds:itemID="{43DCDC71-6238-467A-B31B-CD08A830D706}">
+<ds:datastoreItem xmlns:ds="http://schemas.openxmlformats.org/officeDocument/2006/customXml" ds:itemID="{99B0E88A-0964-497A-82BF-899ABA6DA5A1}">
   <ds:schemaRefs>
     <ds:schemaRef ds:uri="http://schemas.openxmlformats.org/officeDocument/2006/bibliography"/>
   </ds:schemaRefs>

</xml_diff>